<commit_message>
Fix output diagram export for sample folders
</commit_message>
<xml_diff>
--- a/output/Sample 1/Foundation_BusinessDocumentPDF_Bravo_Subscriber_TechSpec.docx
+++ b/output/Sample 1/Foundation_BusinessDocumentPDF_Bravo_Subscriber_TechSpec.docx
@@ -107,7 +107,7 @@
           <w:color w:val="6C757D"/>
           <w:sz w:val="22"/>
         </w:rPr>
-        <w:t>Date: May 01, 2026</w:t>
+        <w:t>Date: May 13, 2026</w:t>
       </w:r>
     </w:p>
     <w:p>
@@ -722,7 +722,7 @@
                 <w:rFonts w:ascii="Calibri" w:hAnsi="Calibri"/>
                 <w:sz w:val="20"/>
               </w:rPr>
-              <w:t>2026-05-01</w:t>
+              <w:t>2026-05-13</w:t>
             </w:r>
           </w:p>
         </w:tc>
@@ -806,7 +806,7 @@
           <w:rFonts w:ascii="Calibri" w:hAnsi="Calibri"/>
           <w:sz w:val="22"/>
         </w:rPr>
-        <w:t>Generated On: 2026-05-01 00:52</w:t>
+        <w:t>Generated On: 2026-05-13 16:11</w:t>
       </w:r>
     </w:p>
     <w:p>
@@ -842,7 +842,7 @@
           <w:rFonts w:ascii="Calibri" w:hAnsi="Calibri"/>
           <w:sz w:val="22"/>
         </w:rPr>
-        <w:t>Functional Spec Context: Not Provided</w:t>
+        <w:t>Functional Spec Context: Provided</w:t>
       </w:r>
     </w:p>
     <w:p>
@@ -894,7 +894,7 @@
           <w:color w:val="212529"/>
           <w:sz w:val="22"/>
         </w:rPr>
-        <w:t>The iFlow Foundation_BusinessDocumentPDF_Bravo_Subscriber receives a business document, extracts the Base64 encoded PDF content, and uploads it to an AWS S3 bucket. It also logs technical exceptions to a JDBC database. This integration automates the process of archiving business documents in PDF format to AWS S3.</w:t>
+        <w:t>This iFlow retrieves a business document in XML format from the Foundation system via HTTPS, extracts the Base64 encoded PDF content, and uploads it to an AWS S3 bucket. It also logs technical exceptions to a JDBC database and updates document metadata.</w:t>
       </w:r>
     </w:p>
     <w:p>
@@ -925,7 +925,7 @@
           <w:color w:val="212529"/>
           <w:sz w:val="22"/>
         </w:rPr>
-        <w:t>This document provides a technical specification for the Foundation_BusinessDocumentPDF_Bravo_Subscriber iFlow, outlining its functionality, configuration, and dependencies.</w:t>
+        <w:t>This document provides the technical specification for the Foundation_BusinessDocumentPDF_Bravo_Subscriber iFlow, detailing its functionality, configuration, and integration points.</w:t>
       </w:r>
     </w:p>
     <w:p>
@@ -956,7 +956,7 @@
           <w:color w:val="212529"/>
           <w:sz w:val="22"/>
         </w:rPr>
-        <w:t>The business requirement is to automatically archive business documents in PDF format to AWS S3 for long-term storage and retrieval.</w:t>
+        <w:t>The interface is required to automatically archive business document PDFs from the Foundation system into AWS S3 for long-term storage and retrieval, as part of the VAT Integration project.</w:t>
       </w:r>
     </w:p>
     <w:p>
@@ -1061,7 +1061,7 @@
                 <w:rFonts w:ascii="Calibri" w:hAnsi="Calibri"/>
                 <w:sz w:val="20"/>
               </w:rPr>
-              <w:t>Real-time</w:t>
+              <w:t>Real time</w:t>
             </w:r>
           </w:p>
         </w:tc>
@@ -1096,7 +1096,7 @@
                 <w:rFonts w:ascii="Calibri" w:hAnsi="Calibri"/>
                 <w:sz w:val="20"/>
               </w:rPr>
-              <w:t>Not configured</w:t>
+              <w:t>TBU</w:t>
             </w:r>
           </w:p>
         </w:tc>
@@ -1164,7 +1164,7 @@
                 <w:rFonts w:ascii="Calibri" w:hAnsi="Calibri"/>
                 <w:sz w:val="20"/>
               </w:rPr>
-              <w:t>Not configured</w:t>
+              <w:t>Not specified</w:t>
             </w:r>
           </w:p>
         </w:tc>
@@ -1500,7 +1500,7 @@
           <w:color w:val="212529"/>
           <w:sz w:val="22"/>
         </w:rPr>
-        <w:t>No automated integration</w:t>
+        <w:t>No automated integration exists. The business document PDF is not automatically extracted and stored in AWS S3.</w:t>
       </w:r>
     </w:p>
     <w:p>
@@ -1531,7 +1531,7 @@
           <w:color w:val="212529"/>
           <w:sz w:val="22"/>
         </w:rPr>
-        <w:t>The integration enables the automated transfer of business document PDFs from the Foundation system to an AWS S3 bucket, along with logging of technical exceptions in a SynLogisticsPlatform database.</w:t>
+        <w:t>The iFlow automates the process of receiving a business document from the Foundation system, extracting the PDF content, and storing it in a designated AWS S3 bucket. It also updates a database with document metadata and logs any technical exceptions encountered during processing.</w:t>
       </w:r>
     </w:p>
     <w:p>
@@ -1562,7 +1562,7 @@
           <w:color w:val="212529"/>
           <w:sz w:val="22"/>
         </w:rPr>
-        <w:t>The iFlow uses an HTTPS sender adapter to receive the business document from the Foundation system. It then extracts the PDF content and uses an Amazon Web Services S3 receiver adapter to upload the PDF to the specified S3 bucket. A JDBC receiver adapter is used to log technical exceptions to a database.</w:t>
+        <w:t>The iFlow uses an HTTPS sender adapter to receive XML payloads from the Foundation system. It extracts the PDF content and uploads it to AWS S3 using the AmazonWebServices receiver adapter. A mapping transforms the data, and Groovy scripts are used for concatenation. JDBC receiver adapter is used to interact with SynLogisticsPlatform_Database.</w:t>
       </w:r>
     </w:p>
     <w:p>
@@ -1818,7 +1818,7 @@
                 <w:rFonts w:ascii="Calibri" w:hAnsi="Calibri"/>
                 <w:sz w:val="20"/>
               </w:rPr>
-              <w:t>Step 1: Foundation system sends a business document via HTTPS to the Integration Suite.</w:t>
+              <w:t>Step 1: Foundation system sends a business document in XML format via HTTPS to the Integration Suite.</w:t>
             </w:r>
           </w:p>
         </w:tc>
@@ -1853,7 +1853,7 @@
                 <w:rFonts w:ascii="Calibri" w:hAnsi="Calibri"/>
                 <w:sz w:val="20"/>
               </w:rPr>
-              <w:t>Step 2: Integration Suite receives the document and extracts the Base64 encoded PDF content, filename, and folder name.</w:t>
+              <w:t>Step 2: Integration Suite receives the XML payload.</w:t>
             </w:r>
           </w:p>
         </w:tc>
@@ -1886,7 +1886,7 @@
                 <w:rFonts w:ascii="Calibri" w:hAnsi="Calibri"/>
                 <w:sz w:val="20"/>
               </w:rPr>
-              <w:t>Step 3: The PDF is uploaded to the specified AWS S3 bucket and folder.</w:t>
+              <w:t>Step 3: The iFlow extracts the Base64 encoded PDF content, folder name, and file name from the XML payload.</w:t>
             </w:r>
           </w:p>
         </w:tc>
@@ -1921,7 +1921,75 @@
                 <w:rFonts w:ascii="Calibri" w:hAnsi="Calibri"/>
                 <w:sz w:val="20"/>
               </w:rPr>
-              <w:t>Step 4: A database table is updated with document metadata, and technical exceptions are logged via JDBC.</w:t>
+              <w:t>Step 4: The PDF is uploaded to the designated AWS S3 bucket.</w:t>
+            </w:r>
+          </w:p>
+        </w:tc>
+      </w:tr>
+      <w:tr>
+        <w:trPr>
+          <w:cantSplit/>
+        </w:trPr>
+        <w:tc>
+          <w:tcPr>
+            <w:tcW w:type="dxa" w:w="3118"/>
+          </w:tcPr>
+          <w:p>
+            <w:r>
+              <w:rPr>
+                <w:rFonts w:ascii="Calibri" w:hAnsi="Calibri"/>
+                <w:sz w:val="20"/>
+              </w:rPr>
+              <w:t>5</w:t>
+            </w:r>
+          </w:p>
+        </w:tc>
+        <w:tc>
+          <w:tcPr>
+            <w:tcW w:type="dxa" w:w="5783"/>
+          </w:tcPr>
+          <w:p>
+            <w:r>
+              <w:rPr>
+                <w:rFonts w:ascii="Calibri" w:hAnsi="Calibri"/>
+                <w:sz w:val="20"/>
+              </w:rPr>
+              <w:t>Step 5: A stored procedure is called to update document metadata in the SynLogisticsPlatform_Database.</w:t>
+            </w:r>
+          </w:p>
+        </w:tc>
+      </w:tr>
+      <w:tr>
+        <w:trPr>
+          <w:cantSplit/>
+        </w:trPr>
+        <w:tc>
+          <w:tcPr>
+            <w:tcW w:type="dxa" w:w="3118"/>
+            <w:shd w:fill="F5F8FA"/>
+          </w:tcPr>
+          <w:p>
+            <w:r>
+              <w:rPr>
+                <w:rFonts w:ascii="Calibri" w:hAnsi="Calibri"/>
+                <w:sz w:val="20"/>
+              </w:rPr>
+              <w:t>6</w:t>
+            </w:r>
+          </w:p>
+        </w:tc>
+        <w:tc>
+          <w:tcPr>
+            <w:tcW w:type="dxa" w:w="5783"/>
+            <w:shd w:fill="F5F8FA"/>
+          </w:tcPr>
+          <w:p>
+            <w:r>
+              <w:rPr>
+                <w:rFonts w:ascii="Calibri" w:hAnsi="Calibri"/>
+                <w:sz w:val="20"/>
+              </w:rPr>
+              <w:t>Step 6: Any exceptions are logged to the SynLogisticsPlatform_Database.</w:t>
             </w:r>
           </w:p>
         </w:tc>
@@ -2049,7 +2117,7 @@
                 <w:rFonts w:ascii="Calibri" w:hAnsi="Calibri"/>
                 <w:sz w:val="20"/>
               </w:rPr>
-              <w:t>Event</w:t>
+              <w:t>HTTPS request</w:t>
             </w:r>
           </w:p>
         </w:tc>
@@ -2081,8 +2149,9 @@
         <w:tblLook w:firstColumn="1" w:firstRow="1" w:lastColumn="0" w:lastRow="0" w:noHBand="0" w:noVBand="1" w:val="04A0"/>
       </w:tblPr>
       <w:tblGrid>
-        <w:gridCol w:w="3118"/>
-        <w:gridCol w:w="5783"/>
+        <w:gridCol w:w="2268"/>
+        <w:gridCol w:w="2835"/>
+        <w:gridCol w:w="3798"/>
       </w:tblGrid>
       <w:tr>
         <w:trPr>
@@ -2091,7 +2160,7 @@
         </w:trPr>
         <w:tc>
           <w:tcPr>
-            <w:tcW w:type="dxa" w:w="3118"/>
+            <w:tcW w:type="dxa" w:w="2268"/>
             <w:shd w:fill="005293"/>
           </w:tcPr>
           <w:p>
@@ -2105,13 +2174,33 @@
                 <w:color w:val="FFFFFF"/>
                 <w:sz w:val="20"/>
               </w:rPr>
-              <w:t>Connection</w:t>
-            </w:r>
-          </w:p>
-        </w:tc>
-        <w:tc>
-          <w:tcPr>
-            <w:tcW w:type="dxa" w:w="5783"/>
+              <w:t>Source</w:t>
+            </w:r>
+          </w:p>
+        </w:tc>
+        <w:tc>
+          <w:tcPr>
+            <w:tcW w:type="dxa" w:w="2835"/>
+            <w:shd w:fill="005293"/>
+          </w:tcPr>
+          <w:p>
+            <w:pPr>
+              <w:keepNext/>
+            </w:pPr>
+            <w:r>
+              <w:rPr>
+                <w:rFonts w:ascii="Calibri" w:hAnsi="Calibri"/>
+                <w:b/>
+                <w:color w:val="FFFFFF"/>
+                <w:sz w:val="20"/>
+              </w:rPr>
+              <w:t>Target</w:t>
+            </w:r>
+          </w:p>
+        </w:tc>
+        <w:tc>
+          <w:tcPr>
+            <w:tcW w:type="dxa" w:w="3798"/>
             <w:shd w:fill="005293"/>
           </w:tcPr>
           <w:p>
@@ -2136,21 +2225,35 @@
         </w:trPr>
         <w:tc>
           <w:tcPr>
-            <w:tcW w:type="dxa" w:w="3118"/>
-          </w:tcPr>
-          <w:p>
-            <w:r>
-              <w:rPr>
-                <w:rFonts w:ascii="Calibri" w:hAnsi="Calibri"/>
-                <w:sz w:val="20"/>
-              </w:rPr>
-              <w:t>call to S3 -&gt; AWS-S3</w:t>
-            </w:r>
-          </w:p>
-        </w:tc>
-        <w:tc>
-          <w:tcPr>
-            <w:tcW w:type="dxa" w:w="5783"/>
+            <w:tcW w:type="dxa" w:w="2268"/>
+          </w:tcPr>
+          <w:p>
+            <w:r>
+              <w:rPr>
+                <w:rFonts w:ascii="Calibri" w:hAnsi="Calibri"/>
+                <w:sz w:val="20"/>
+              </w:rPr>
+              <w:t>call to S3</w:t>
+            </w:r>
+          </w:p>
+        </w:tc>
+        <w:tc>
+          <w:tcPr>
+            <w:tcW w:type="dxa" w:w="2835"/>
+          </w:tcPr>
+          <w:p>
+            <w:r>
+              <w:rPr>
+                <w:rFonts w:ascii="Calibri" w:hAnsi="Calibri"/>
+                <w:sz w:val="20"/>
+              </w:rPr>
+              <w:t>AWS-S3</w:t>
+            </w:r>
+          </w:p>
+        </w:tc>
+        <w:tc>
+          <w:tcPr>
+            <w:tcW w:type="dxa" w:w="3798"/>
           </w:tcPr>
           <w:p>
             <w:r>
@@ -2169,7 +2272,7 @@
         </w:trPr>
         <w:tc>
           <w:tcPr>
-            <w:tcW w:type="dxa" w:w="3118"/>
+            <w:tcW w:type="dxa" w:w="2268"/>
             <w:shd w:fill="F5F8FA"/>
           </w:tcPr>
           <w:p>
@@ -2178,13 +2281,28 @@
                 <w:rFonts w:ascii="Calibri" w:hAnsi="Calibri"/>
                 <w:sz w:val="20"/>
               </w:rPr>
-              <w:t>Query JDBC -&gt; SynLogisticsPlatform_Database</w:t>
-            </w:r>
-          </w:p>
-        </w:tc>
-        <w:tc>
-          <w:tcPr>
-            <w:tcW w:type="dxa" w:w="5783"/>
+              <w:t>Query JDBC</w:t>
+            </w:r>
+          </w:p>
+        </w:tc>
+        <w:tc>
+          <w:tcPr>
+            <w:tcW w:type="dxa" w:w="2835"/>
+            <w:shd w:fill="F5F8FA"/>
+          </w:tcPr>
+          <w:p>
+            <w:r>
+              <w:rPr>
+                <w:rFonts w:ascii="Calibri" w:hAnsi="Calibri"/>
+                <w:sz w:val="20"/>
+              </w:rPr>
+              <w:t>SynLogisticsPlatform_Database</w:t>
+            </w:r>
+          </w:p>
+        </w:tc>
+        <w:tc>
+          <w:tcPr>
+            <w:tcW w:type="dxa" w:w="3798"/>
             <w:shd w:fill="F5F8FA"/>
           </w:tcPr>
           <w:p>
@@ -2204,21 +2322,35 @@
         </w:trPr>
         <w:tc>
           <w:tcPr>
-            <w:tcW w:type="dxa" w:w="3118"/>
-          </w:tcPr>
-          <w:p>
-            <w:r>
-              <w:rPr>
-                <w:rFonts w:ascii="Calibri" w:hAnsi="Calibri"/>
-                <w:sz w:val="20"/>
-              </w:rPr>
-              <w:t>Foundation -&gt; Start</w:t>
-            </w:r>
-          </w:p>
-        </w:tc>
-        <w:tc>
-          <w:tcPr>
-            <w:tcW w:type="dxa" w:w="5783"/>
+            <w:tcW w:type="dxa" w:w="2268"/>
+          </w:tcPr>
+          <w:p>
+            <w:r>
+              <w:rPr>
+                <w:rFonts w:ascii="Calibri" w:hAnsi="Calibri"/>
+                <w:sz w:val="20"/>
+              </w:rPr>
+              <w:t>Foundation</w:t>
+            </w:r>
+          </w:p>
+        </w:tc>
+        <w:tc>
+          <w:tcPr>
+            <w:tcW w:type="dxa" w:w="2835"/>
+          </w:tcPr>
+          <w:p>
+            <w:r>
+              <w:rPr>
+                <w:rFonts w:ascii="Calibri" w:hAnsi="Calibri"/>
+                <w:sz w:val="20"/>
+              </w:rPr>
+              <w:t>Start</w:t>
+            </w:r>
+          </w:p>
+        </w:tc>
+        <w:tc>
+          <w:tcPr>
+            <w:tcW w:type="dxa" w:w="3798"/>
           </w:tcPr>
           <w:p>
             <w:r>
@@ -2256,7 +2388,7 @@
       <w:r>
         <w:drawing>
           <wp:inline xmlns:a="http://schemas.openxmlformats.org/drawingml/2006/main" xmlns:pic="http://schemas.openxmlformats.org/drawingml/2006/picture">
-            <wp:extent cx="5669280" cy="3118572"/>
+            <wp:extent cx="5669280" cy="2400002"/>
             <wp:docPr id="1" name="Picture 1"/>
             <wp:cNvGraphicFramePr>
               <a:graphicFrameLocks noChangeAspect="1"/>
@@ -2277,7 +2409,7 @@
                   <pic:spPr>
                     <a:xfrm>
                       <a:off x="0" y="0"/>
-                      <a:ext cx="5669280" cy="3118572"/>
+                      <a:ext cx="5669280" cy="2400002"/>
                     </a:xfrm>
                     <a:prstGeom prst="rect"/>
                   </pic:spPr>
@@ -2432,614 +2564,6 @@
                 <w:rFonts w:ascii="Calibri" w:hAnsi="Calibri"/>
                 <w:sz w:val="20"/>
               </w:rPr>
-              <w:t>Invoke JDBC</w:t>
-            </w:r>
-          </w:p>
-        </w:tc>
-        <w:tc>
-          <w:tcPr>
-            <w:tcW w:type="dxa" w:w="2835"/>
-          </w:tcPr>
-          <w:p>
-            <w:r>
-              <w:rPr>
-                <w:rFonts w:ascii="Calibri" w:hAnsi="Calibri"/>
-                <w:sz w:val="20"/>
-              </w:rPr>
-              <w:t>2</w:t>
-            </w:r>
-          </w:p>
-        </w:tc>
-        <w:tc>
-          <w:tcPr>
-            <w:tcW w:type="dxa" w:w="3798"/>
-          </w:tcPr>
-          <w:p>
-            <w:r>
-              <w:rPr>
-                <w:rFonts w:ascii="Calibri" w:hAnsi="Calibri"/>
-                <w:sz w:val="20"/>
-              </w:rPr>
-              <w:t>3</w:t>
-            </w:r>
-          </w:p>
-        </w:tc>
-      </w:tr>
-    </w:tbl>
-    <w:p/>
-    <w:p>
-      <w:pPr>
-        <w:pStyle w:val="Heading3"/>
-        <w:keepNext/>
-        <w:keepLines/>
-        <w:outlineLvl w:val="2"/>
-      </w:pPr>
-      <w:r>
-        <w:rPr>
-          <w:rFonts w:ascii="Calibri Light" w:hAnsi="Calibri Light"/>
-          <w:color w:val="212529"/>
-          <w:sz w:val="24"/>
-        </w:rPr>
-        <w:t>Invoke JDBC</w:t>
-      </w:r>
-    </w:p>
-    <w:p>
-      <w:pPr>
-        <w:spacing w:after="160" w:line="276" w:lineRule="auto"/>
-      </w:pPr>
-      <w:r>
-        <w:rPr>
-          <w:rFonts w:ascii="Calibri" w:hAnsi="Calibri"/>
-          <w:b w:val="0"/>
-          <w:i w:val="0"/>
-          <w:color w:val="212529"/>
-          <w:sz w:val="22"/>
-        </w:rPr>
-        <w:t>This process calls a JDBC receiver adapter to execute a database query.</w:t>
-      </w:r>
-    </w:p>
-    <w:tbl>
-      <w:tblPr>
-        <w:tblStyle w:val="TableGrid"/>
-        <w:tblW w:type="auto" w:w="0"/>
-        <w:jc w:val="left"/>
-        <w:tblLayout w:type="fixed"/>
-        <w:tblLook w:firstColumn="1" w:firstRow="1" w:lastColumn="0" w:lastRow="0" w:noHBand="0" w:noVBand="1" w:val="04A0"/>
-      </w:tblPr>
-      <w:tblGrid>
-        <w:gridCol w:w="9000"/>
-      </w:tblGrid>
-      <w:tr>
-        <w:trPr>
-          <w:tblHeader w:val="true"/>
-          <w:cantSplit/>
-        </w:trPr>
-        <w:tc>
-          <w:tcPr>
-            <w:tcW w:type="dxa" w:w="9000"/>
-            <w:shd w:fill="005293"/>
-          </w:tcPr>
-          <w:p>
-            <w:pPr>
-              <w:keepNext/>
-            </w:pPr>
-            <w:r>
-              <w:rPr>
-                <w:rFonts w:ascii="Calibri" w:hAnsi="Calibri"/>
-                <w:b/>
-                <w:color w:val="FFFFFF"/>
-                <w:sz w:val="20"/>
-              </w:rPr>
-              <w:t>Key Activity</w:t>
-            </w:r>
-          </w:p>
-        </w:tc>
-      </w:tr>
-      <w:tr>
-        <w:trPr>
-          <w:cantSplit/>
-        </w:trPr>
-        <w:tc>
-          <w:tcPr>
-            <w:tcW w:type="dxa" w:w="9000"/>
-          </w:tcPr>
-          <w:p>
-            <w:r>
-              <w:rPr>
-                <w:rFonts w:ascii="Calibri" w:hAnsi="Calibri"/>
-                <w:sz w:val="20"/>
-              </w:rPr>
-              <w:t>ExternalCall</w:t>
-            </w:r>
-          </w:p>
-        </w:tc>
-      </w:tr>
-    </w:tbl>
-    <w:p/>
-    <w:tbl>
-      <w:tblPr>
-        <w:tblStyle w:val="TableGrid"/>
-        <w:tblW w:type="auto" w:w="0"/>
-        <w:jc w:val="left"/>
-        <w:tblLayout w:type="fixed"/>
-        <w:tblLook w:firstColumn="1" w:firstRow="1" w:lastColumn="0" w:lastRow="0" w:noHBand="0" w:noVBand="1" w:val="04A0"/>
-      </w:tblPr>
-      <w:tblGrid>
-        <w:gridCol w:w="3118"/>
-        <w:gridCol w:w="5783"/>
-      </w:tblGrid>
-      <w:tr>
-        <w:trPr>
-          <w:tblHeader w:val="true"/>
-          <w:cantSplit/>
-        </w:trPr>
-        <w:tc>
-          <w:tcPr>
-            <w:tcW w:type="dxa" w:w="3118"/>
-            <w:shd w:fill="005293"/>
-          </w:tcPr>
-          <w:p>
-            <w:pPr>
-              <w:keepNext/>
-            </w:pPr>
-            <w:r>
-              <w:rPr>
-                <w:rFonts w:ascii="Calibri" w:hAnsi="Calibri"/>
-                <w:b/>
-                <w:color w:val="FFFFFF"/>
-                <w:sz w:val="20"/>
-              </w:rPr>
-              <w:t>Step</w:t>
-            </w:r>
-          </w:p>
-        </w:tc>
-        <w:tc>
-          <w:tcPr>
-            <w:tcW w:type="dxa" w:w="5783"/>
-            <w:shd w:fill="005293"/>
-          </w:tcPr>
-          <w:p>
-            <w:pPr>
-              <w:keepNext/>
-            </w:pPr>
-            <w:r>
-              <w:rPr>
-                <w:rFonts w:ascii="Calibri" w:hAnsi="Calibri"/>
-                <w:b/>
-                <w:color w:val="FFFFFF"/>
-                <w:sz w:val="20"/>
-              </w:rPr>
-              <w:t>Description</w:t>
-            </w:r>
-          </w:p>
-        </w:tc>
-      </w:tr>
-      <w:tr>
-        <w:trPr>
-          <w:cantSplit/>
-        </w:trPr>
-        <w:tc>
-          <w:tcPr>
-            <w:tcW w:type="dxa" w:w="3118"/>
-          </w:tcPr>
-          <w:p>
-            <w:r>
-              <w:rPr>
-                <w:rFonts w:ascii="Calibri" w:hAnsi="Calibri"/>
-                <w:sz w:val="20"/>
-              </w:rPr>
-              <w:t>1</w:t>
-            </w:r>
-          </w:p>
-        </w:tc>
-        <w:tc>
-          <w:tcPr>
-            <w:tcW w:type="dxa" w:w="5783"/>
-          </w:tcPr>
-          <w:p>
-            <w:r>
-              <w:rPr>
-                <w:rFonts w:ascii="Calibri" w:hAnsi="Calibri"/>
-                <w:sz w:val="20"/>
-              </w:rPr>
-              <w:t>Step 1: Start event.</w:t>
-            </w:r>
-          </w:p>
-        </w:tc>
-      </w:tr>
-      <w:tr>
-        <w:trPr>
-          <w:cantSplit/>
-        </w:trPr>
-        <w:tc>
-          <w:tcPr>
-            <w:tcW w:type="dxa" w:w="3118"/>
-            <w:shd w:fill="F5F8FA"/>
-          </w:tcPr>
-          <w:p>
-            <w:r>
-              <w:rPr>
-                <w:rFonts w:ascii="Calibri" w:hAnsi="Calibri"/>
-                <w:sz w:val="20"/>
-              </w:rPr>
-              <w:t>2</w:t>
-            </w:r>
-          </w:p>
-        </w:tc>
-        <w:tc>
-          <w:tcPr>
-            <w:tcW w:type="dxa" w:w="5783"/>
-            <w:shd w:fill="F5F8FA"/>
-          </w:tcPr>
-          <w:p>
-            <w:r>
-              <w:rPr>
-                <w:rFonts w:ascii="Calibri" w:hAnsi="Calibri"/>
-                <w:sz w:val="20"/>
-              </w:rPr>
-              <w:t>Step 2: Service task to query JDBC.</w:t>
-            </w:r>
-          </w:p>
-        </w:tc>
-      </w:tr>
-      <w:tr>
-        <w:trPr>
-          <w:cantSplit/>
-        </w:trPr>
-        <w:tc>
-          <w:tcPr>
-            <w:tcW w:type="dxa" w:w="3118"/>
-          </w:tcPr>
-          <w:p>
-            <w:r>
-              <w:rPr>
-                <w:rFonts w:ascii="Calibri" w:hAnsi="Calibri"/>
-                <w:sz w:val="20"/>
-              </w:rPr>
-              <w:t>3</w:t>
-            </w:r>
-          </w:p>
-        </w:tc>
-        <w:tc>
-          <w:tcPr>
-            <w:tcW w:type="dxa" w:w="5783"/>
-          </w:tcPr>
-          <w:p>
-            <w:r>
-              <w:rPr>
-                <w:rFonts w:ascii="Calibri" w:hAnsi="Calibri"/>
-                <w:sz w:val="20"/>
-              </w:rPr>
-              <w:t>Step 3: End event.</w:t>
-            </w:r>
-          </w:p>
-        </w:tc>
-      </w:tr>
-    </w:tbl>
-    <w:p/>
-    <w:tbl>
-      <w:tblPr>
-        <w:tblStyle w:val="TableGrid"/>
-        <w:tblW w:type="auto" w:w="0"/>
-        <w:jc w:val="left"/>
-        <w:tblLayout w:type="fixed"/>
-        <w:tblLook w:firstColumn="1" w:firstRow="1" w:lastColumn="0" w:lastRow="0" w:noHBand="0" w:noVBand="1" w:val="04A0"/>
-      </w:tblPr>
-      <w:tblGrid>
-        <w:gridCol w:w="3118"/>
-        <w:gridCol w:w="5783"/>
-      </w:tblGrid>
-      <w:tr>
-        <w:trPr>
-          <w:tblHeader w:val="true"/>
-          <w:cantSplit/>
-        </w:trPr>
-        <w:tc>
-          <w:tcPr>
-            <w:tcW w:type="dxa" w:w="3118"/>
-            <w:shd w:fill="005293"/>
-          </w:tcPr>
-          <w:p>
-            <w:pPr>
-              <w:keepNext/>
-            </w:pPr>
-            <w:r>
-              <w:rPr>
-                <w:rFonts w:ascii="Calibri" w:hAnsi="Calibri"/>
-                <w:b/>
-                <w:color w:val="FFFFFF"/>
-                <w:sz w:val="20"/>
-              </w:rPr>
-              <w:t>Key</w:t>
-            </w:r>
-          </w:p>
-        </w:tc>
-        <w:tc>
-          <w:tcPr>
-            <w:tcW w:type="dxa" w:w="5783"/>
-            <w:shd w:fill="005293"/>
-          </w:tcPr>
-          <w:p>
-            <w:pPr>
-              <w:keepNext/>
-            </w:pPr>
-            <w:r>
-              <w:rPr>
-                <w:rFonts w:ascii="Calibri" w:hAnsi="Calibri"/>
-                <w:b/>
-                <w:color w:val="FFFFFF"/>
-                <w:sz w:val="20"/>
-              </w:rPr>
-              <w:t>Value</w:t>
-            </w:r>
-          </w:p>
-        </w:tc>
-      </w:tr>
-      <w:tr>
-        <w:trPr>
-          <w:cantSplit/>
-        </w:trPr>
-        <w:tc>
-          <w:tcPr>
-            <w:tcW w:type="dxa" w:w="3118"/>
-          </w:tcPr>
-          <w:p>
-            <w:r>
-              <w:rPr>
-                <w:rFonts w:ascii="Calibri" w:hAnsi="Calibri"/>
-                <w:sz w:val="20"/>
-              </w:rPr>
-              <w:t>Transaction Timeout</w:t>
-            </w:r>
-          </w:p>
-        </w:tc>
-        <w:tc>
-          <w:tcPr>
-            <w:tcW w:type="dxa" w:w="5783"/>
-          </w:tcPr>
-          <w:p>
-            <w:r>
-              <w:rPr>
-                <w:rFonts w:ascii="Calibri" w:hAnsi="Calibri"/>
-                <w:sz w:val="20"/>
-              </w:rPr>
-              <w:t>30</w:t>
-            </w:r>
-          </w:p>
-        </w:tc>
-      </w:tr>
-      <w:tr>
-        <w:trPr>
-          <w:cantSplit/>
-        </w:trPr>
-        <w:tc>
-          <w:tcPr>
-            <w:tcW w:type="dxa" w:w="3118"/>
-            <w:shd w:fill="F5F8FA"/>
-          </w:tcPr>
-          <w:p>
-            <w:r>
-              <w:rPr>
-                <w:rFonts w:ascii="Calibri" w:hAnsi="Calibri"/>
-                <w:sz w:val="20"/>
-              </w:rPr>
-              <w:t>Process Type</w:t>
-            </w:r>
-          </w:p>
-        </w:tc>
-        <w:tc>
-          <w:tcPr>
-            <w:tcW w:type="dxa" w:w="5783"/>
-            <w:shd w:fill="F5F8FA"/>
-          </w:tcPr>
-          <w:p>
-            <w:r>
-              <w:rPr>
-                <w:rFonts w:ascii="Calibri" w:hAnsi="Calibri"/>
-                <w:sz w:val="20"/>
-              </w:rPr>
-              <w:t>directCall</w:t>
-            </w:r>
-          </w:p>
-        </w:tc>
-      </w:tr>
-      <w:tr>
-        <w:trPr>
-          <w:cantSplit/>
-        </w:trPr>
-        <w:tc>
-          <w:tcPr>
-            <w:tcW w:type="dxa" w:w="3118"/>
-          </w:tcPr>
-          <w:p>
-            <w:r>
-              <w:rPr>
-                <w:rFonts w:ascii="Calibri" w:hAnsi="Calibri"/>
-                <w:sz w:val="20"/>
-              </w:rPr>
-              <w:t>Transactional Handling</w:t>
-            </w:r>
-          </w:p>
-        </w:tc>
-        <w:tc>
-          <w:tcPr>
-            <w:tcW w:type="dxa" w:w="5783"/>
-          </w:tcPr>
-          <w:p>
-            <w:r>
-              <w:rPr>
-                <w:rFonts w:ascii="Calibri" w:hAnsi="Calibri"/>
-                <w:sz w:val="20"/>
-              </w:rPr>
-              <w:t>From Calling Process</w:t>
-            </w:r>
-          </w:p>
-        </w:tc>
-      </w:tr>
-    </w:tbl>
-    <w:p/>
-    <w:p>
-      <w:pPr>
-        <w:pStyle w:val="Heading2"/>
-        <w:keepNext/>
-        <w:keepLines/>
-        <w:outlineLvl w:val="1"/>
-      </w:pPr>
-      <w:r>
-        <w:rPr>
-          <w:rFonts w:ascii="Calibri Light" w:hAnsi="Calibri Light"/>
-          <w:color w:val="0078B4"/>
-          <w:sz w:val="28"/>
-        </w:rPr>
-        <w:t>5.2 Local Integration Process</w:t>
-      </w:r>
-    </w:p>
-    <w:p>
-      <w:pPr>
-        <w:jc w:val="center"/>
-      </w:pPr>
-      <w:r>
-        <w:drawing>
-          <wp:inline xmlns:a="http://schemas.openxmlformats.org/drawingml/2006/main" xmlns:pic="http://schemas.openxmlformats.org/drawingml/2006/picture">
-            <wp:extent cx="5303520" cy="3013482"/>
-            <wp:docPr id="2" name="Picture 2"/>
-            <wp:cNvGraphicFramePr>
-              <a:graphicFrameLocks noChangeAspect="1"/>
-            </wp:cNvGraphicFramePr>
-            <a:graphic>
-              <a:graphicData uri="http://schemas.openxmlformats.org/drawingml/2006/picture">
-                <pic:pic>
-                  <pic:nvPicPr>
-                    <pic:cNvPr id="0" name="image.png"/>
-                    <pic:cNvPicPr/>
-                  </pic:nvPicPr>
-                  <pic:blipFill>
-                    <a:blip r:embed="rId12"/>
-                    <a:stretch>
-                      <a:fillRect/>
-                    </a:stretch>
-                  </pic:blipFill>
-                  <pic:spPr>
-                    <a:xfrm>
-                      <a:off x="0" y="0"/>
-                      <a:ext cx="5303520" cy="3013482"/>
-                    </a:xfrm>
-                    <a:prstGeom prst="rect"/>
-                  </pic:spPr>
-                </pic:pic>
-              </a:graphicData>
-            </a:graphic>
-          </wp:inline>
-        </w:drawing>
-      </w:r>
-    </w:p>
-    <w:p>
-      <w:pPr>
-        <w:jc w:val="center"/>
-      </w:pPr>
-      <w:r>
-        <w:rPr>
-          <w:i/>
-          <w:color w:val="6C757D"/>
-          <w:sz w:val="20"/>
-        </w:rPr>
-        <w:t>Figure: Integration Process Diagram</w:t>
-      </w:r>
-    </w:p>
-    <w:p/>
-    <w:tbl>
-      <w:tblPr>
-        <w:tblStyle w:val="TableGrid"/>
-        <w:tblW w:type="auto" w:w="0"/>
-        <w:jc w:val="left"/>
-        <w:tblLayout w:type="fixed"/>
-        <w:tblLook w:firstColumn="1" w:firstRow="1" w:lastColumn="0" w:lastRow="0" w:noHBand="0" w:noVBand="1" w:val="04A0"/>
-      </w:tblPr>
-      <w:tblGrid>
-        <w:gridCol w:w="2268"/>
-        <w:gridCol w:w="2835"/>
-        <w:gridCol w:w="3798"/>
-      </w:tblGrid>
-      <w:tr>
-        <w:trPr>
-          <w:tblHeader w:val="true"/>
-          <w:cantSplit/>
-        </w:trPr>
-        <w:tc>
-          <w:tcPr>
-            <w:tcW w:type="dxa" w:w="2268"/>
-            <w:shd w:fill="005293"/>
-          </w:tcPr>
-          <w:p>
-            <w:pPr>
-              <w:keepNext/>
-            </w:pPr>
-            <w:r>
-              <w:rPr>
-                <w:rFonts w:ascii="Calibri" w:hAnsi="Calibri"/>
-                <w:b/>
-                <w:color w:val="FFFFFF"/>
-                <w:sz w:val="20"/>
-              </w:rPr>
-              <w:t>Process Name</w:t>
-            </w:r>
-          </w:p>
-        </w:tc>
-        <w:tc>
-          <w:tcPr>
-            <w:tcW w:type="dxa" w:w="2835"/>
-            <w:shd w:fill="005293"/>
-          </w:tcPr>
-          <w:p>
-            <w:pPr>
-              <w:keepNext/>
-            </w:pPr>
-            <w:r>
-              <w:rPr>
-                <w:rFonts w:ascii="Calibri" w:hAnsi="Calibri"/>
-                <w:b/>
-                <w:color w:val="FFFFFF"/>
-                <w:sz w:val="20"/>
-              </w:rPr>
-              <w:t>Sequence Flows</w:t>
-            </w:r>
-          </w:p>
-        </w:tc>
-        <w:tc>
-          <w:tcPr>
-            <w:tcW w:type="dxa" w:w="3798"/>
-            <w:shd w:fill="005293"/>
-          </w:tcPr>
-          <w:p>
-            <w:pPr>
-              <w:keepNext/>
-            </w:pPr>
-            <w:r>
-              <w:rPr>
-                <w:rFonts w:ascii="Calibri" w:hAnsi="Calibri"/>
-                <w:b/>
-                <w:color w:val="FFFFFF"/>
-                <w:sz w:val="20"/>
-              </w:rPr>
-              <w:t>Flow Elements</w:t>
-            </w:r>
-          </w:p>
-        </w:tc>
-      </w:tr>
-      <w:tr>
-        <w:trPr>
-          <w:cantSplit/>
-        </w:trPr>
-        <w:tc>
-          <w:tcPr>
-            <w:tcW w:type="dxa" w:w="2268"/>
-          </w:tcPr>
-          <w:p>
-            <w:r>
-              <w:rPr>
-                <w:rFonts w:ascii="Calibri" w:hAnsi="Calibri"/>
-                <w:sz w:val="20"/>
-              </w:rPr>
               <w:t>Integration Process</w:t>
             </w:r>
           </w:p>
@@ -3103,7 +2627,7 @@
           <w:color w:val="212529"/>
           <w:sz w:val="22"/>
         </w:rPr>
-        <w:t>This is the main integration process that orchestrates the flow of messages, data transformation, and calls to external systems.</w:t>
+        <w:t>This is the main integration process that orchestrates the flow of data from the Foundation system to AWS S3 and the SynLogisticsPlatform_Database.</w:t>
       </w:r>
     </w:p>
     <w:tbl>
@@ -3177,7 +2701,7 @@
                 <w:rFonts w:ascii="Calibri" w:hAnsi="Calibri"/>
                 <w:sz w:val="20"/>
               </w:rPr>
-              <w:t>ExternalCall</w:t>
+              <w:t>Service Task</w:t>
             </w:r>
           </w:p>
         </w:tc>
@@ -3289,7 +2813,7 @@
                 <w:rFonts w:ascii="Calibri" w:hAnsi="Calibri"/>
                 <w:sz w:val="20"/>
               </w:rPr>
-              <w:t>Step 1: Receive message from HTTPS sender.</w:t>
+              <w:t>Start Event</w:t>
             </w:r>
           </w:p>
         </w:tc>
@@ -3324,7 +2848,7 @@
                 <w:rFonts w:ascii="Calibri" w:hAnsi="Calibri"/>
                 <w:sz w:val="20"/>
               </w:rPr>
-              <w:t>Step 2: Extract properties from payload.</w:t>
+              <w:t>log payload</w:t>
             </w:r>
           </w:p>
         </w:tc>
@@ -3357,7 +2881,7 @@
                 <w:rFonts w:ascii="Calibri" w:hAnsi="Calibri"/>
                 <w:sz w:val="20"/>
               </w:rPr>
-              <w:t>Step 3: Upload PDF to AWS S3.</w:t>
+              <w:t>Filter</w:t>
             </w:r>
           </w:p>
         </w:tc>
@@ -3392,7 +2916,7 @@
                 <w:rFonts w:ascii="Calibri" w:hAnsi="Calibri"/>
                 <w:sz w:val="20"/>
               </w:rPr>
-              <w:t>Step 4: Update database with document metadata.</w:t>
+              <w:t>set body</w:t>
             </w:r>
           </w:p>
         </w:tc>
@@ -3425,7 +2949,75 @@
                 <w:rFonts w:ascii="Calibri" w:hAnsi="Calibri"/>
                 <w:sz w:val="20"/>
               </w:rPr>
-              <w:t>Step 5: Handle exceptions.</w:t>
+              <w:t>call to S3</w:t>
+            </w:r>
+          </w:p>
+        </w:tc>
+      </w:tr>
+      <w:tr>
+        <w:trPr>
+          <w:cantSplit/>
+        </w:trPr>
+        <w:tc>
+          <w:tcPr>
+            <w:tcW w:type="dxa" w:w="3118"/>
+            <w:shd w:fill="F5F8FA"/>
+          </w:tcPr>
+          <w:p>
+            <w:r>
+              <w:rPr>
+                <w:rFonts w:ascii="Calibri" w:hAnsi="Calibri"/>
+                <w:sz w:val="20"/>
+              </w:rPr>
+              <w:t>6</w:t>
+            </w:r>
+          </w:p>
+        </w:tc>
+        <w:tc>
+          <w:tcPr>
+            <w:tcW w:type="dxa" w:w="5783"/>
+            <w:shd w:fill="F5F8FA"/>
+          </w:tcPr>
+          <w:p>
+            <w:r>
+              <w:rPr>
+                <w:rFonts w:ascii="Calibri" w:hAnsi="Calibri"/>
+                <w:sz w:val="20"/>
+              </w:rPr>
+              <w:t>Query formation</w:t>
+            </w:r>
+          </w:p>
+        </w:tc>
+      </w:tr>
+      <w:tr>
+        <w:trPr>
+          <w:cantSplit/>
+        </w:trPr>
+        <w:tc>
+          <w:tcPr>
+            <w:tcW w:type="dxa" w:w="3118"/>
+          </w:tcPr>
+          <w:p>
+            <w:r>
+              <w:rPr>
+                <w:rFonts w:ascii="Calibri" w:hAnsi="Calibri"/>
+                <w:sz w:val="20"/>
+              </w:rPr>
+              <w:t>7</w:t>
+            </w:r>
+          </w:p>
+        </w:tc>
+        <w:tc>
+          <w:tcPr>
+            <w:tcW w:type="dxa" w:w="5783"/>
+          </w:tcPr>
+          <w:p>
+            <w:r>
+              <w:rPr>
+                <w:rFonts w:ascii="Calibri" w:hAnsi="Calibri"/>
+                <w:sz w:val="20"/>
+              </w:rPr>
+              <w:t>End Event</w:t>
             </w:r>
           </w:p>
         </w:tc>
@@ -3441,8 +3033,9 @@
         <w:tblLook w:firstColumn="1" w:firstRow="1" w:lastColumn="0" w:lastRow="0" w:noHBand="0" w:noVBand="1" w:val="04A0"/>
       </w:tblPr>
       <w:tblGrid>
-        <w:gridCol w:w="3118"/>
-        <w:gridCol w:w="5783"/>
+        <w:gridCol w:w="2268"/>
+        <w:gridCol w:w="2835"/>
+        <w:gridCol w:w="3798"/>
       </w:tblGrid>
       <w:tr>
         <w:trPr>
@@ -3451,7 +3044,7 @@
         </w:trPr>
         <w:tc>
           <w:tcPr>
-            <w:tcW w:type="dxa" w:w="3118"/>
+            <w:tcW w:type="dxa" w:w="2268"/>
             <w:shd w:fill="005293"/>
           </w:tcPr>
           <w:p>
@@ -3465,13 +3058,33 @@
                 <w:color w:val="FFFFFF"/>
                 <w:sz w:val="20"/>
               </w:rPr>
+              <w:t>Component Name</w:t>
+            </w:r>
+          </w:p>
+        </w:tc>
+        <w:tc>
+          <w:tcPr>
+            <w:tcW w:type="dxa" w:w="2835"/>
+            <w:shd w:fill="005293"/>
+          </w:tcPr>
+          <w:p>
+            <w:pPr>
+              <w:keepNext/>
+            </w:pPr>
+            <w:r>
+              <w:rPr>
+                <w:rFonts w:ascii="Calibri" w:hAnsi="Calibri"/>
+                <w:b/>
+                <w:color w:val="FFFFFF"/>
+                <w:sz w:val="20"/>
+              </w:rPr>
               <w:t>Key</w:t>
             </w:r>
           </w:p>
         </w:tc>
         <w:tc>
           <w:tcPr>
-            <w:tcW w:type="dxa" w:w="5783"/>
+            <w:tcW w:type="dxa" w:w="3798"/>
             <w:shd w:fill="005293"/>
           </w:tcPr>
           <w:p>
@@ -3496,7 +3109,21 @@
         </w:trPr>
         <w:tc>
           <w:tcPr>
-            <w:tcW w:type="dxa" w:w="3118"/>
+            <w:tcW w:type="dxa" w:w="2268"/>
+          </w:tcPr>
+          <w:p>
+            <w:r>
+              <w:rPr>
+                <w:rFonts w:ascii="Calibri" w:hAnsi="Calibri"/>
+                <w:sz w:val="20"/>
+              </w:rPr>
+              <w:t>Integration Process</w:t>
+            </w:r>
+          </w:p>
+        </w:tc>
+        <w:tc>
+          <w:tcPr>
+            <w:tcW w:type="dxa" w:w="2835"/>
           </w:tcPr>
           <w:p>
             <w:r>
@@ -3510,7 +3137,7 @@
         </w:tc>
         <w:tc>
           <w:tcPr>
-            <w:tcW w:type="dxa" w:w="5783"/>
+            <w:tcW w:type="dxa" w:w="3798"/>
           </w:tcPr>
           <w:p>
             <w:r>
@@ -3529,7 +3156,7 @@
         </w:trPr>
         <w:tc>
           <w:tcPr>
-            <w:tcW w:type="dxa" w:w="3118"/>
+            <w:tcW w:type="dxa" w:w="2268"/>
             <w:shd w:fill="F5F8FA"/>
           </w:tcPr>
           <w:p>
@@ -3538,13 +3165,28 @@
                 <w:rFonts w:ascii="Calibri" w:hAnsi="Calibri"/>
                 <w:sz w:val="20"/>
               </w:rPr>
+              <w:t>Integration Process</w:t>
+            </w:r>
+          </w:p>
+        </w:tc>
+        <w:tc>
+          <w:tcPr>
+            <w:tcW w:type="dxa" w:w="2835"/>
+            <w:shd w:fill="F5F8FA"/>
+          </w:tcPr>
+          <w:p>
+            <w:r>
+              <w:rPr>
+                <w:rFonts w:ascii="Calibri" w:hAnsi="Calibri"/>
+                <w:sz w:val="20"/>
+              </w:rPr>
               <w:t>Transactional Handling</w:t>
             </w:r>
           </w:p>
         </w:tc>
         <w:tc>
           <w:tcPr>
-            <w:tcW w:type="dxa" w:w="5783"/>
+            <w:tcW w:type="dxa" w:w="3798"/>
             <w:shd w:fill="F5F8FA"/>
           </w:tcPr>
           <w:p>
@@ -4332,6 +3974,678 @@
           <w:color w:val="0078B4"/>
           <w:sz w:val="28"/>
         </w:rPr>
+        <w:t>5.2 Local Integration Process</w:t>
+      </w:r>
+    </w:p>
+    <w:p>
+      <w:pPr>
+        <w:jc w:val="center"/>
+      </w:pPr>
+      <w:r>
+        <w:drawing>
+          <wp:inline xmlns:a="http://schemas.openxmlformats.org/drawingml/2006/main" xmlns:pic="http://schemas.openxmlformats.org/drawingml/2006/picture">
+            <wp:extent cx="5303520" cy="2709247"/>
+            <wp:docPr id="2" name="Picture 2"/>
+            <wp:cNvGraphicFramePr>
+              <a:graphicFrameLocks noChangeAspect="1"/>
+            </wp:cNvGraphicFramePr>
+            <a:graphic>
+              <a:graphicData uri="http://schemas.openxmlformats.org/drawingml/2006/picture">
+                <pic:pic>
+                  <pic:nvPicPr>
+                    <pic:cNvPr id="0" name="image.png"/>
+                    <pic:cNvPicPr/>
+                  </pic:nvPicPr>
+                  <pic:blipFill>
+                    <a:blip r:embed="rId12"/>
+                    <a:stretch>
+                      <a:fillRect/>
+                    </a:stretch>
+                  </pic:blipFill>
+                  <pic:spPr>
+                    <a:xfrm>
+                      <a:off x="0" y="0"/>
+                      <a:ext cx="5303520" cy="2709247"/>
+                    </a:xfrm>
+                    <a:prstGeom prst="rect"/>
+                  </pic:spPr>
+                </pic:pic>
+              </a:graphicData>
+            </a:graphic>
+          </wp:inline>
+        </w:drawing>
+      </w:r>
+    </w:p>
+    <w:p>
+      <w:pPr>
+        <w:jc w:val="center"/>
+      </w:pPr>
+      <w:r>
+        <w:rPr>
+          <w:i/>
+          <w:color w:val="6C757D"/>
+          <w:sz w:val="20"/>
+        </w:rPr>
+        <w:t>Figure: Invoke JDBC Diagram</w:t>
+      </w:r>
+    </w:p>
+    <w:p/>
+    <w:tbl>
+      <w:tblPr>
+        <w:tblStyle w:val="TableGrid"/>
+        <w:tblW w:type="auto" w:w="0"/>
+        <w:jc w:val="left"/>
+        <w:tblLayout w:type="fixed"/>
+        <w:tblLook w:firstColumn="1" w:firstRow="1" w:lastColumn="0" w:lastRow="0" w:noHBand="0" w:noVBand="1" w:val="04A0"/>
+      </w:tblPr>
+      <w:tblGrid>
+        <w:gridCol w:w="2268"/>
+        <w:gridCol w:w="2835"/>
+        <w:gridCol w:w="3798"/>
+      </w:tblGrid>
+      <w:tr>
+        <w:trPr>
+          <w:tblHeader w:val="true"/>
+          <w:cantSplit/>
+        </w:trPr>
+        <w:tc>
+          <w:tcPr>
+            <w:tcW w:type="dxa" w:w="2268"/>
+            <w:shd w:fill="005293"/>
+          </w:tcPr>
+          <w:p>
+            <w:pPr>
+              <w:keepNext/>
+            </w:pPr>
+            <w:r>
+              <w:rPr>
+                <w:rFonts w:ascii="Calibri" w:hAnsi="Calibri"/>
+                <w:b/>
+                <w:color w:val="FFFFFF"/>
+                <w:sz w:val="20"/>
+              </w:rPr>
+              <w:t>Process Name</w:t>
+            </w:r>
+          </w:p>
+        </w:tc>
+        <w:tc>
+          <w:tcPr>
+            <w:tcW w:type="dxa" w:w="2835"/>
+            <w:shd w:fill="005293"/>
+          </w:tcPr>
+          <w:p>
+            <w:pPr>
+              <w:keepNext/>
+            </w:pPr>
+            <w:r>
+              <w:rPr>
+                <w:rFonts w:ascii="Calibri" w:hAnsi="Calibri"/>
+                <w:b/>
+                <w:color w:val="FFFFFF"/>
+                <w:sz w:val="20"/>
+              </w:rPr>
+              <w:t>Sequence Flows</w:t>
+            </w:r>
+          </w:p>
+        </w:tc>
+        <w:tc>
+          <w:tcPr>
+            <w:tcW w:type="dxa" w:w="3798"/>
+            <w:shd w:fill="005293"/>
+          </w:tcPr>
+          <w:p>
+            <w:pPr>
+              <w:keepNext/>
+            </w:pPr>
+            <w:r>
+              <w:rPr>
+                <w:rFonts w:ascii="Calibri" w:hAnsi="Calibri"/>
+                <w:b/>
+                <w:color w:val="FFFFFF"/>
+                <w:sz w:val="20"/>
+              </w:rPr>
+              <w:t>Flow Elements</w:t>
+            </w:r>
+          </w:p>
+        </w:tc>
+      </w:tr>
+      <w:tr>
+        <w:trPr>
+          <w:cantSplit/>
+        </w:trPr>
+        <w:tc>
+          <w:tcPr>
+            <w:tcW w:type="dxa" w:w="2268"/>
+          </w:tcPr>
+          <w:p>
+            <w:r>
+              <w:rPr>
+                <w:rFonts w:ascii="Calibri" w:hAnsi="Calibri"/>
+                <w:sz w:val="20"/>
+              </w:rPr>
+              <w:t>Invoke JDBC</w:t>
+            </w:r>
+          </w:p>
+        </w:tc>
+        <w:tc>
+          <w:tcPr>
+            <w:tcW w:type="dxa" w:w="2835"/>
+          </w:tcPr>
+          <w:p>
+            <w:r>
+              <w:rPr>
+                <w:rFonts w:ascii="Calibri" w:hAnsi="Calibri"/>
+                <w:sz w:val="20"/>
+              </w:rPr>
+              <w:t>2</w:t>
+            </w:r>
+          </w:p>
+        </w:tc>
+        <w:tc>
+          <w:tcPr>
+            <w:tcW w:type="dxa" w:w="3798"/>
+          </w:tcPr>
+          <w:p>
+            <w:r>
+              <w:rPr>
+                <w:rFonts w:ascii="Calibri" w:hAnsi="Calibri"/>
+                <w:sz w:val="20"/>
+              </w:rPr>
+              <w:t>3</w:t>
+            </w:r>
+          </w:p>
+        </w:tc>
+      </w:tr>
+    </w:tbl>
+    <w:p/>
+    <w:p>
+      <w:pPr>
+        <w:pStyle w:val="Heading3"/>
+        <w:keepNext/>
+        <w:keepLines/>
+        <w:outlineLvl w:val="2"/>
+      </w:pPr>
+      <w:r>
+        <w:rPr>
+          <w:rFonts w:ascii="Calibri Light" w:hAnsi="Calibri Light"/>
+          <w:color w:val="212529"/>
+          <w:sz w:val="24"/>
+        </w:rPr>
+        <w:t>Invoke JDBC</w:t>
+      </w:r>
+    </w:p>
+    <w:p>
+      <w:pPr>
+        <w:spacing w:after="160" w:line="276" w:lineRule="auto"/>
+      </w:pPr>
+      <w:r>
+        <w:rPr>
+          <w:rFonts w:ascii="Calibri" w:hAnsi="Calibri"/>
+          <w:b w:val="0"/>
+          <w:i w:val="0"/>
+          <w:color w:val="212529"/>
+          <w:sz w:val="22"/>
+        </w:rPr>
+        <w:t>This process is a local integration process that calls the JDBC receiver adapter to execute a database query.</w:t>
+      </w:r>
+    </w:p>
+    <w:tbl>
+      <w:tblPr>
+        <w:tblStyle w:val="TableGrid"/>
+        <w:tblW w:type="auto" w:w="0"/>
+        <w:jc w:val="left"/>
+        <w:tblLayout w:type="fixed"/>
+        <w:tblLook w:firstColumn="1" w:firstRow="1" w:lastColumn="0" w:lastRow="0" w:noHBand="0" w:noVBand="1" w:val="04A0"/>
+      </w:tblPr>
+      <w:tblGrid>
+        <w:gridCol w:w="9000"/>
+      </w:tblGrid>
+      <w:tr>
+        <w:trPr>
+          <w:tblHeader w:val="true"/>
+          <w:cantSplit/>
+        </w:trPr>
+        <w:tc>
+          <w:tcPr>
+            <w:tcW w:type="dxa" w:w="9000"/>
+            <w:shd w:fill="005293"/>
+          </w:tcPr>
+          <w:p>
+            <w:pPr>
+              <w:keepNext/>
+            </w:pPr>
+            <w:r>
+              <w:rPr>
+                <w:rFonts w:ascii="Calibri" w:hAnsi="Calibri"/>
+                <w:b/>
+                <w:color w:val="FFFFFF"/>
+                <w:sz w:val="20"/>
+              </w:rPr>
+              <w:t>Key Activity</w:t>
+            </w:r>
+          </w:p>
+        </w:tc>
+      </w:tr>
+      <w:tr>
+        <w:trPr>
+          <w:cantSplit/>
+        </w:trPr>
+        <w:tc>
+          <w:tcPr>
+            <w:tcW w:type="dxa" w:w="9000"/>
+          </w:tcPr>
+          <w:p>
+            <w:r>
+              <w:rPr>
+                <w:rFonts w:ascii="Calibri" w:hAnsi="Calibri"/>
+                <w:sz w:val="20"/>
+              </w:rPr>
+              <w:t>ExternalCall to JDBC receiver adapter</w:t>
+            </w:r>
+          </w:p>
+        </w:tc>
+      </w:tr>
+    </w:tbl>
+    <w:p/>
+    <w:tbl>
+      <w:tblPr>
+        <w:tblStyle w:val="TableGrid"/>
+        <w:tblW w:type="auto" w:w="0"/>
+        <w:jc w:val="left"/>
+        <w:tblLayout w:type="fixed"/>
+        <w:tblLook w:firstColumn="1" w:firstRow="1" w:lastColumn="0" w:lastRow="0" w:noHBand="0" w:noVBand="1" w:val="04A0"/>
+      </w:tblPr>
+      <w:tblGrid>
+        <w:gridCol w:w="3118"/>
+        <w:gridCol w:w="5783"/>
+      </w:tblGrid>
+      <w:tr>
+        <w:trPr>
+          <w:tblHeader w:val="true"/>
+          <w:cantSplit/>
+        </w:trPr>
+        <w:tc>
+          <w:tcPr>
+            <w:tcW w:type="dxa" w:w="3118"/>
+            <w:shd w:fill="005293"/>
+          </w:tcPr>
+          <w:p>
+            <w:pPr>
+              <w:keepNext/>
+            </w:pPr>
+            <w:r>
+              <w:rPr>
+                <w:rFonts w:ascii="Calibri" w:hAnsi="Calibri"/>
+                <w:b/>
+                <w:color w:val="FFFFFF"/>
+                <w:sz w:val="20"/>
+              </w:rPr>
+              <w:t>Step</w:t>
+            </w:r>
+          </w:p>
+        </w:tc>
+        <w:tc>
+          <w:tcPr>
+            <w:tcW w:type="dxa" w:w="5783"/>
+            <w:shd w:fill="005293"/>
+          </w:tcPr>
+          <w:p>
+            <w:pPr>
+              <w:keepNext/>
+            </w:pPr>
+            <w:r>
+              <w:rPr>
+                <w:rFonts w:ascii="Calibri" w:hAnsi="Calibri"/>
+                <w:b/>
+                <w:color w:val="FFFFFF"/>
+                <w:sz w:val="20"/>
+              </w:rPr>
+              <w:t>Description</w:t>
+            </w:r>
+          </w:p>
+        </w:tc>
+      </w:tr>
+      <w:tr>
+        <w:trPr>
+          <w:cantSplit/>
+        </w:trPr>
+        <w:tc>
+          <w:tcPr>
+            <w:tcW w:type="dxa" w:w="3118"/>
+          </w:tcPr>
+          <w:p>
+            <w:r>
+              <w:rPr>
+                <w:rFonts w:ascii="Calibri" w:hAnsi="Calibri"/>
+                <w:sz w:val="20"/>
+              </w:rPr>
+              <w:t>1</w:t>
+            </w:r>
+          </w:p>
+        </w:tc>
+        <w:tc>
+          <w:tcPr>
+            <w:tcW w:type="dxa" w:w="5783"/>
+          </w:tcPr>
+          <w:p>
+            <w:r>
+              <w:rPr>
+                <w:rFonts w:ascii="Calibri" w:hAnsi="Calibri"/>
+                <w:sz w:val="20"/>
+              </w:rPr>
+              <w:t>Step 1: Start Event</w:t>
+            </w:r>
+          </w:p>
+        </w:tc>
+      </w:tr>
+      <w:tr>
+        <w:trPr>
+          <w:cantSplit/>
+        </w:trPr>
+        <w:tc>
+          <w:tcPr>
+            <w:tcW w:type="dxa" w:w="3118"/>
+            <w:shd w:fill="F5F8FA"/>
+          </w:tcPr>
+          <w:p>
+            <w:r>
+              <w:rPr>
+                <w:rFonts w:ascii="Calibri" w:hAnsi="Calibri"/>
+                <w:sz w:val="20"/>
+              </w:rPr>
+              <w:t>2</w:t>
+            </w:r>
+          </w:p>
+        </w:tc>
+        <w:tc>
+          <w:tcPr>
+            <w:tcW w:type="dxa" w:w="5783"/>
+            <w:shd w:fill="F5F8FA"/>
+          </w:tcPr>
+          <w:p>
+            <w:r>
+              <w:rPr>
+                <w:rFonts w:ascii="Calibri" w:hAnsi="Calibri"/>
+                <w:sz w:val="20"/>
+              </w:rPr>
+              <w:t>Step 2: Query JDBC Service Task</w:t>
+            </w:r>
+          </w:p>
+        </w:tc>
+      </w:tr>
+      <w:tr>
+        <w:trPr>
+          <w:cantSplit/>
+        </w:trPr>
+        <w:tc>
+          <w:tcPr>
+            <w:tcW w:type="dxa" w:w="3118"/>
+          </w:tcPr>
+          <w:p>
+            <w:r>
+              <w:rPr>
+                <w:rFonts w:ascii="Calibri" w:hAnsi="Calibri"/>
+                <w:sz w:val="20"/>
+              </w:rPr>
+              <w:t>3</w:t>
+            </w:r>
+          </w:p>
+        </w:tc>
+        <w:tc>
+          <w:tcPr>
+            <w:tcW w:type="dxa" w:w="5783"/>
+          </w:tcPr>
+          <w:p>
+            <w:r>
+              <w:rPr>
+                <w:rFonts w:ascii="Calibri" w:hAnsi="Calibri"/>
+                <w:sz w:val="20"/>
+              </w:rPr>
+              <w:t>Step 3: End Event</w:t>
+            </w:r>
+          </w:p>
+        </w:tc>
+      </w:tr>
+    </w:tbl>
+    <w:p/>
+    <w:tbl>
+      <w:tblPr>
+        <w:tblStyle w:val="TableGrid"/>
+        <w:tblW w:type="auto" w:w="0"/>
+        <w:jc w:val="left"/>
+        <w:tblLayout w:type="fixed"/>
+        <w:tblLook w:firstColumn="1" w:firstRow="1" w:lastColumn="0" w:lastRow="0" w:noHBand="0" w:noVBand="1" w:val="04A0"/>
+      </w:tblPr>
+      <w:tblGrid>
+        <w:gridCol w:w="2268"/>
+        <w:gridCol w:w="2835"/>
+        <w:gridCol w:w="3798"/>
+      </w:tblGrid>
+      <w:tr>
+        <w:trPr>
+          <w:tblHeader w:val="true"/>
+          <w:cantSplit/>
+        </w:trPr>
+        <w:tc>
+          <w:tcPr>
+            <w:tcW w:type="dxa" w:w="2268"/>
+            <w:shd w:fill="005293"/>
+          </w:tcPr>
+          <w:p>
+            <w:pPr>
+              <w:keepNext/>
+            </w:pPr>
+            <w:r>
+              <w:rPr>
+                <w:rFonts w:ascii="Calibri" w:hAnsi="Calibri"/>
+                <w:b/>
+                <w:color w:val="FFFFFF"/>
+                <w:sz w:val="20"/>
+              </w:rPr>
+              <w:t>Component Name</w:t>
+            </w:r>
+          </w:p>
+        </w:tc>
+        <w:tc>
+          <w:tcPr>
+            <w:tcW w:type="dxa" w:w="2835"/>
+            <w:shd w:fill="005293"/>
+          </w:tcPr>
+          <w:p>
+            <w:pPr>
+              <w:keepNext/>
+            </w:pPr>
+            <w:r>
+              <w:rPr>
+                <w:rFonts w:ascii="Calibri" w:hAnsi="Calibri"/>
+                <w:b/>
+                <w:color w:val="FFFFFF"/>
+                <w:sz w:val="20"/>
+              </w:rPr>
+              <w:t>Key</w:t>
+            </w:r>
+          </w:p>
+        </w:tc>
+        <w:tc>
+          <w:tcPr>
+            <w:tcW w:type="dxa" w:w="3798"/>
+            <w:shd w:fill="005293"/>
+          </w:tcPr>
+          <w:p>
+            <w:pPr>
+              <w:keepNext/>
+            </w:pPr>
+            <w:r>
+              <w:rPr>
+                <w:rFonts w:ascii="Calibri" w:hAnsi="Calibri"/>
+                <w:b/>
+                <w:color w:val="FFFFFF"/>
+                <w:sz w:val="20"/>
+              </w:rPr>
+              <w:t>Value</w:t>
+            </w:r>
+          </w:p>
+        </w:tc>
+      </w:tr>
+      <w:tr>
+        <w:trPr>
+          <w:cantSplit/>
+        </w:trPr>
+        <w:tc>
+          <w:tcPr>
+            <w:tcW w:type="dxa" w:w="2268"/>
+          </w:tcPr>
+          <w:p>
+            <w:r>
+              <w:rPr>
+                <w:rFonts w:ascii="Calibri" w:hAnsi="Calibri"/>
+                <w:sz w:val="20"/>
+              </w:rPr>
+              <w:t>Invoke JDBC</w:t>
+            </w:r>
+          </w:p>
+        </w:tc>
+        <w:tc>
+          <w:tcPr>
+            <w:tcW w:type="dxa" w:w="2835"/>
+          </w:tcPr>
+          <w:p>
+            <w:r>
+              <w:rPr>
+                <w:rFonts w:ascii="Calibri" w:hAnsi="Calibri"/>
+                <w:sz w:val="20"/>
+              </w:rPr>
+              <w:t>Transaction Timeout</w:t>
+            </w:r>
+          </w:p>
+        </w:tc>
+        <w:tc>
+          <w:tcPr>
+            <w:tcW w:type="dxa" w:w="3798"/>
+          </w:tcPr>
+          <w:p>
+            <w:r>
+              <w:rPr>
+                <w:rFonts w:ascii="Calibri" w:hAnsi="Calibri"/>
+                <w:sz w:val="20"/>
+              </w:rPr>
+              <w:t>30</w:t>
+            </w:r>
+          </w:p>
+        </w:tc>
+      </w:tr>
+      <w:tr>
+        <w:trPr>
+          <w:cantSplit/>
+        </w:trPr>
+        <w:tc>
+          <w:tcPr>
+            <w:tcW w:type="dxa" w:w="2268"/>
+            <w:shd w:fill="F5F8FA"/>
+          </w:tcPr>
+          <w:p>
+            <w:r>
+              <w:rPr>
+                <w:rFonts w:ascii="Calibri" w:hAnsi="Calibri"/>
+                <w:sz w:val="20"/>
+              </w:rPr>
+              <w:t>Invoke JDBC</w:t>
+            </w:r>
+          </w:p>
+        </w:tc>
+        <w:tc>
+          <w:tcPr>
+            <w:tcW w:type="dxa" w:w="2835"/>
+            <w:shd w:fill="F5F8FA"/>
+          </w:tcPr>
+          <w:p>
+            <w:r>
+              <w:rPr>
+                <w:rFonts w:ascii="Calibri" w:hAnsi="Calibri"/>
+                <w:sz w:val="20"/>
+              </w:rPr>
+              <w:t>Process Type</w:t>
+            </w:r>
+          </w:p>
+        </w:tc>
+        <w:tc>
+          <w:tcPr>
+            <w:tcW w:type="dxa" w:w="3798"/>
+            <w:shd w:fill="F5F8FA"/>
+          </w:tcPr>
+          <w:p>
+            <w:r>
+              <w:rPr>
+                <w:rFonts w:ascii="Calibri" w:hAnsi="Calibri"/>
+                <w:sz w:val="20"/>
+              </w:rPr>
+              <w:t>directCall</w:t>
+            </w:r>
+          </w:p>
+        </w:tc>
+      </w:tr>
+      <w:tr>
+        <w:trPr>
+          <w:cantSplit/>
+        </w:trPr>
+        <w:tc>
+          <w:tcPr>
+            <w:tcW w:type="dxa" w:w="2268"/>
+          </w:tcPr>
+          <w:p>
+            <w:r>
+              <w:rPr>
+                <w:rFonts w:ascii="Calibri" w:hAnsi="Calibri"/>
+                <w:sz w:val="20"/>
+              </w:rPr>
+              <w:t>Invoke JDBC</w:t>
+            </w:r>
+          </w:p>
+        </w:tc>
+        <w:tc>
+          <w:tcPr>
+            <w:tcW w:type="dxa" w:w="2835"/>
+          </w:tcPr>
+          <w:p>
+            <w:r>
+              <w:rPr>
+                <w:rFonts w:ascii="Calibri" w:hAnsi="Calibri"/>
+                <w:sz w:val="20"/>
+              </w:rPr>
+              <w:t>Transactional Handling</w:t>
+            </w:r>
+          </w:p>
+        </w:tc>
+        <w:tc>
+          <w:tcPr>
+            <w:tcW w:type="dxa" w:w="3798"/>
+          </w:tcPr>
+          <w:p>
+            <w:r>
+              <w:rPr>
+                <w:rFonts w:ascii="Calibri" w:hAnsi="Calibri"/>
+                <w:sz w:val="20"/>
+              </w:rPr>
+              <w:t>From Calling Process</w:t>
+            </w:r>
+          </w:p>
+        </w:tc>
+      </w:tr>
+    </w:tbl>
+    <w:p/>
+    <w:p>
+      <w:pPr>
+        <w:pStyle w:val="Heading2"/>
+        <w:keepNext/>
+        <w:keepLines/>
+        <w:outlineLvl w:val="1"/>
+      </w:pPr>
+      <w:r>
+        <w:rPr>
+          <w:rFonts w:ascii="Calibri Light" w:hAnsi="Calibri Light"/>
+          <w:color w:val="0078B4"/>
+          <w:sz w:val="28"/>
+        </w:rPr>
         <w:t>5.3 Sender</w:t>
       </w:r>
     </w:p>
@@ -4342,7 +4656,7 @@
       <w:r>
         <w:drawing>
           <wp:inline xmlns:a="http://schemas.openxmlformats.org/drawingml/2006/main" xmlns:pic="http://schemas.openxmlformats.org/drawingml/2006/picture">
-            <wp:extent cx="4754880" cy="3835802"/>
+            <wp:extent cx="4754880" cy="3837790"/>
             <wp:docPr id="3" name="Picture 3"/>
             <wp:cNvGraphicFramePr>
               <a:graphicFrameLocks noChangeAspect="1"/>
@@ -4363,7 +4677,7 @@
                   <pic:spPr>
                     <a:xfrm>
                       <a:off x="0" y="0"/>
-                      <a:ext cx="4754880" cy="3835802"/>
+                      <a:ext cx="4754880" cy="3837790"/>
                     </a:xfrm>
                     <a:prstGeom prst="rect"/>
                   </pic:spPr>
@@ -4400,7 +4714,7 @@
           <w:color w:val="212529"/>
           <w:sz w:val="22"/>
         </w:rPr>
-        <w:t>The HTTPS sender adapter receives the business document from the Foundation system. It is configured to use role-based authentication, requiring the ESBMessaging.send role. The maximum body size is set to 40 MB.</w:t>
+        <w:t>The HTTPS sender adapter receives the business document in XML format from the Foundation system. It uses role-based authentication, requiring the ESBMessaging.send role. The maximum body size is set to 40MB.</w:t>
       </w:r>
     </w:p>
     <w:tbl>
@@ -4626,6 +4940,182 @@
                 <w:sz w:val="20"/>
               </w:rPr>
               <w:t>ESBMessaging.send</w:t>
+            </w:r>
+          </w:p>
+        </w:tc>
+      </w:tr>
+    </w:tbl>
+    <w:p/>
+    <w:p>
+      <w:pPr>
+        <w:spacing w:after="80" w:line="276" w:lineRule="auto"/>
+      </w:pPr>
+      <w:r>
+        <w:rPr>
+          <w:rFonts w:ascii="Calibri" w:hAnsi="Calibri"/>
+          <w:b/>
+          <w:i w:val="0"/>
+          <w:color w:val="212529"/>
+          <w:sz w:val="22"/>
+        </w:rPr>
+        <w:t>Table: Detailed Sender Adapter Properties</w:t>
+      </w:r>
+    </w:p>
+    <w:tbl>
+      <w:tblPr>
+        <w:tblStyle w:val="TableGrid"/>
+        <w:tblW w:type="auto" w:w="0"/>
+        <w:jc w:val="left"/>
+        <w:tblLayout w:type="fixed"/>
+        <w:tblLook w:firstColumn="1" w:firstRow="1" w:lastColumn="0" w:lastRow="0" w:noHBand="0" w:noVBand="1" w:val="04A0"/>
+      </w:tblPr>
+      <w:tblGrid>
+        <w:gridCol w:w="3118"/>
+        <w:gridCol w:w="5783"/>
+      </w:tblGrid>
+      <w:tr>
+        <w:trPr>
+          <w:tblHeader w:val="true"/>
+          <w:cantSplit/>
+        </w:trPr>
+        <w:tc>
+          <w:tcPr>
+            <w:tcW w:type="dxa" w:w="3118"/>
+            <w:shd w:fill="005293"/>
+          </w:tcPr>
+          <w:p>
+            <w:pPr>
+              <w:keepNext/>
+            </w:pPr>
+            <w:r>
+              <w:rPr>
+                <w:rFonts w:ascii="Calibri" w:hAnsi="Calibri"/>
+                <w:b/>
+                <w:color w:val="FFFFFF"/>
+                <w:sz w:val="20"/>
+              </w:rPr>
+              <w:t>Key</w:t>
+            </w:r>
+          </w:p>
+        </w:tc>
+        <w:tc>
+          <w:tcPr>
+            <w:tcW w:type="dxa" w:w="5783"/>
+            <w:shd w:fill="005293"/>
+          </w:tcPr>
+          <w:p>
+            <w:pPr>
+              <w:keepNext/>
+            </w:pPr>
+            <w:r>
+              <w:rPr>
+                <w:rFonts w:ascii="Calibri" w:hAnsi="Calibri"/>
+                <w:b/>
+                <w:color w:val="FFFFFF"/>
+                <w:sz w:val="20"/>
+              </w:rPr>
+              <w:t>Value</w:t>
+            </w:r>
+          </w:p>
+        </w:tc>
+      </w:tr>
+      <w:tr>
+        <w:trPr>
+          <w:cantSplit/>
+        </w:trPr>
+        <w:tc>
+          <w:tcPr>
+            <w:tcW w:type="dxa" w:w="3118"/>
+          </w:tcPr>
+          <w:p>
+            <w:r>
+              <w:rPr>
+                <w:rFonts w:ascii="Calibri" w:hAnsi="Calibri"/>
+                <w:sz w:val="20"/>
+              </w:rPr>
+              <w:t>Maximum Body Size</w:t>
+            </w:r>
+          </w:p>
+        </w:tc>
+        <w:tc>
+          <w:tcPr>
+            <w:tcW w:type="dxa" w:w="5783"/>
+          </w:tcPr>
+          <w:p>
+            <w:r>
+              <w:rPr>
+                <w:rFonts w:ascii="Calibri" w:hAnsi="Calibri"/>
+                <w:sz w:val="20"/>
+              </w:rPr>
+              <w:t>40</w:t>
+            </w:r>
+          </w:p>
+        </w:tc>
+      </w:tr>
+      <w:tr>
+        <w:trPr>
+          <w:cantSplit/>
+        </w:trPr>
+        <w:tc>
+          <w:tcPr>
+            <w:tcW w:type="dxa" w:w="3118"/>
+            <w:shd w:fill="F5F8FA"/>
+          </w:tcPr>
+          <w:p>
+            <w:r>
+              <w:rPr>
+                <w:rFonts w:ascii="Calibri" w:hAnsi="Calibri"/>
+                <w:sz w:val="20"/>
+              </w:rPr>
+              <w:t>System</w:t>
+            </w:r>
+          </w:p>
+        </w:tc>
+        <w:tc>
+          <w:tcPr>
+            <w:tcW w:type="dxa" w:w="5783"/>
+            <w:shd w:fill="F5F8FA"/>
+          </w:tcPr>
+          <w:p>
+            <w:r>
+              <w:rPr>
+                <w:rFonts w:ascii="Calibri" w:hAnsi="Calibri"/>
+                <w:sz w:val="20"/>
+              </w:rPr>
+              <w:t>Foundation</w:t>
+            </w:r>
+          </w:p>
+        </w:tc>
+      </w:tr>
+      <w:tr>
+        <w:trPr>
+          <w:cantSplit/>
+        </w:trPr>
+        <w:tc>
+          <w:tcPr>
+            <w:tcW w:type="dxa" w:w="3118"/>
+          </w:tcPr>
+          <w:p>
+            <w:r>
+              <w:rPr>
+                <w:rFonts w:ascii="Calibri" w:hAnsi="Calibri"/>
+                <w:sz w:val="20"/>
+              </w:rPr>
+              <w:t>Xsrf Protection</w:t>
+            </w:r>
+          </w:p>
+        </w:tc>
+        <w:tc>
+          <w:tcPr>
+            <w:tcW w:type="dxa" w:w="5783"/>
+          </w:tcPr>
+          <w:p>
+            <w:r>
+              <w:rPr>
+                <w:rFonts w:ascii="Calibri" w:hAnsi="Calibri"/>
+                <w:sz w:val="20"/>
+              </w:rPr>
+              <w:t>0</w:t>
             </w:r>
           </w:p>
         </w:tc>
@@ -4655,7 +5145,7 @@
       <w:r>
         <w:drawing>
           <wp:inline xmlns:a="http://schemas.openxmlformats.org/drawingml/2006/main" xmlns:pic="http://schemas.openxmlformats.org/drawingml/2006/picture">
-            <wp:extent cx="4754880" cy="3835802"/>
+            <wp:extent cx="4754880" cy="3837790"/>
             <wp:docPr id="4" name="Picture 4"/>
             <wp:cNvGraphicFramePr>
               <a:graphicFrameLocks noChangeAspect="1"/>
@@ -4676,7 +5166,7 @@
                   <pic:spPr>
                     <a:xfrm>
                       <a:off x="0" y="0"/>
-                      <a:ext cx="4754880" cy="3835802"/>
+                      <a:ext cx="4754880" cy="3837790"/>
                     </a:xfrm>
                     <a:prstGeom prst="rect"/>
                   </pic:spPr>
@@ -4713,7 +5203,7 @@
           <w:color w:val="212529"/>
           <w:sz w:val="22"/>
         </w:rPr>
-        <w:t>The Amazon Web Services S3 receiver adapter uploads the PDF to the specified S3 bucket. It is configured to use HTTPS and access key/secret key authentication. Server-side encryption (SSE-S3) is enabled.</w:t>
+        <w:t>The AmazonWebServices receiver adapter uploads the PDF document to the specified S3 bucket. It uses the provided Access Key and Secret Key for authentication. Server-side encryption (SSE-S3) is enabled.</w:t>
       </w:r>
     </w:p>
     <w:tbl>
@@ -4947,66 +5437,17 @@
     <w:p/>
     <w:p>
       <w:pPr>
-        <w:pStyle w:val="Heading2"/>
-        <w:keepNext/>
-        <w:keepLines/>
-        <w:outlineLvl w:val="1"/>
-      </w:pPr>
-      <w:r>
-        <w:rPr>
-          <w:rFonts w:ascii="Calibri Light" w:hAnsi="Calibri Light"/>
-          <w:color w:val="0078B4"/>
-          <w:sz w:val="28"/>
-        </w:rPr>
-        <w:t>5.5 Mappings</w:t>
-      </w:r>
-    </w:p>
-    <w:p>
-      <w:pPr>
-        <w:pStyle w:val="Heading3"/>
-        <w:keepNext/>
-        <w:keepLines/>
-        <w:outlineLvl w:val="2"/>
-        <w:collapsed w:val="1"/>
-        <w15:collapsed xmlns:w15="http://schemas.microsoft.com/office/word/2012/wordml"/>
-      </w:pPr>
-      <w:r>
-        <w:rPr>
-          <w:rFonts w:ascii="Calibri Light" w:hAnsi="Calibri Light"/>
-          <w:color w:val="212529"/>
-          <w:sz w:val="24"/>
-        </w:rPr>
-        <w:t>BusinessDocumentMapping</w:t>
-      </w:r>
-    </w:p>
-    <w:p>
-      <w:pPr>
-        <w:spacing w:after="160" w:line="276" w:lineRule="auto"/>
+        <w:spacing w:after="80" w:line="276" w:lineRule="auto"/>
       </w:pPr>
       <w:r>
         <w:rPr>
           <w:rFonts w:ascii="Calibri" w:hAnsi="Calibri"/>
-          <w:b w:val="0"/>
+          <w:b/>
           <w:i w:val="0"/>
           <w:color w:val="212529"/>
           <w:sz w:val="22"/>
         </w:rPr>
-        <w:t>This mapping applies the configured transformation logic for BusinessDocumentMapping within SAP CI.</w:t>
-      </w:r>
-    </w:p>
-    <w:p>
-      <w:pPr>
-        <w:spacing w:after="160" w:line="276" w:lineRule="auto"/>
-      </w:pPr>
-      <w:r>
-        <w:rPr>
-          <w:rFonts w:ascii="Calibri" w:hAnsi="Calibri"/>
-          <w:b w:val="0"/>
-          <w:i w:val="0"/>
-          <w:color w:val="212529"/>
-          <w:sz w:val="22"/>
-        </w:rPr>
-        <w:t>It is executed during message processing to reshape the payload before the next handoff.</w:t>
+        <w:t>Table: Detailed Receiver Adapter Properties</w:t>
       </w:r>
     </w:p>
     <w:tbl>
@@ -5042,7 +5483,7 @@
                 <w:color w:val="FFFFFF"/>
                 <w:sz w:val="20"/>
               </w:rPr>
-              <w:t>Attribute</w:t>
+              <w:t>Key</w:t>
             </w:r>
           </w:p>
         </w:tc>
@@ -5081,7 +5522,7 @@
                 <w:rFonts w:ascii="Calibri" w:hAnsi="Calibri"/>
                 <w:sz w:val="20"/>
               </w:rPr>
-              <w:t>Source Message / Object</w:t>
+              <w:t>Bucket Name</w:t>
             </w:r>
           </w:p>
         </w:tc>
@@ -5095,7 +5536,7 @@
                 <w:rFonts w:ascii="Calibri" w:hAnsi="Calibri"/>
                 <w:sz w:val="20"/>
               </w:rPr>
-              <w:t>BusinessDocumentMapping</w:t>
+              <w:t>idt-test-document-data</w:t>
             </w:r>
           </w:p>
         </w:tc>
@@ -5115,7 +5556,7 @@
                 <w:rFonts w:ascii="Calibri" w:hAnsi="Calibri"/>
                 <w:sz w:val="20"/>
               </w:rPr>
-              <w:t>Target Message / Object</w:t>
+              <w:t>File Name</w:t>
             </w:r>
           </w:p>
         </w:tc>
@@ -5130,7 +5571,7 @@
                 <w:rFonts w:ascii="Calibri" w:hAnsi="Calibri"/>
                 <w:sz w:val="20"/>
               </w:rPr>
-              <w:t>Not identified</w:t>
+              <w:t>${property.FileName}.pdf</w:t>
             </w:r>
           </w:p>
         </w:tc>
@@ -5149,7 +5590,7 @@
                 <w:rFonts w:ascii="Calibri" w:hAnsi="Calibri"/>
                 <w:sz w:val="20"/>
               </w:rPr>
-              <w:t>Mapping File</w:t>
+              <w:t>S3 Server Side Encryption For Archive</w:t>
             </w:r>
           </w:p>
         </w:tc>
@@ -5163,7 +5604,1251 @@
                 <w:rFonts w:ascii="Calibri" w:hAnsi="Calibri"/>
                 <w:sz w:val="20"/>
               </w:rPr>
+              <w:t>SSE-S3</w:t>
+            </w:r>
+          </w:p>
+        </w:tc>
+      </w:tr>
+      <w:tr>
+        <w:trPr>
+          <w:cantSplit/>
+        </w:trPr>
+        <w:tc>
+          <w:tcPr>
+            <w:tcW w:type="dxa" w:w="3118"/>
+            <w:shd w:fill="F5F8FA"/>
+          </w:tcPr>
+          <w:p>
+            <w:r>
+              <w:rPr>
+                <w:rFonts w:ascii="Calibri" w:hAnsi="Calibri"/>
+                <w:sz w:val="20"/>
+              </w:rPr>
+              <w:t>Empty File Handling</w:t>
+            </w:r>
+          </w:p>
+        </w:tc>
+        <w:tc>
+          <w:tcPr>
+            <w:tcW w:type="dxa" w:w="5783"/>
+            <w:shd w:fill="F5F8FA"/>
+          </w:tcPr>
+          <w:p>
+            <w:r>
+              <w:rPr>
+                <w:rFonts w:ascii="Calibri" w:hAnsi="Calibri"/>
+                <w:sz w:val="20"/>
+              </w:rPr>
+              <w:t>proceedWithEmptyFile</w:t>
+            </w:r>
+          </w:p>
+        </w:tc>
+      </w:tr>
+      <w:tr>
+        <w:trPr>
+          <w:cantSplit/>
+        </w:trPr>
+        <w:tc>
+          <w:tcPr>
+            <w:tcW w:type="dxa" w:w="3118"/>
+          </w:tcPr>
+          <w:p>
+            <w:r>
+              <w:rPr>
+                <w:rFonts w:ascii="Calibri" w:hAnsi="Calibri"/>
+                <w:sz w:val="20"/>
+              </w:rPr>
+              <w:t>S3 Receiver Post Processing</w:t>
+            </w:r>
+          </w:p>
+        </w:tc>
+        <w:tc>
+          <w:tcPr>
+            <w:tcW w:type="dxa" w:w="5783"/>
+          </w:tcPr>
+          <w:p>
+            <w:r>
+              <w:rPr>
+                <w:rFonts w:ascii="Calibri" w:hAnsi="Calibri"/>
+                <w:sz w:val="20"/>
+              </w:rPr>
+              <w:t>delete</w:t>
+            </w:r>
+          </w:p>
+        </w:tc>
+      </w:tr>
+      <w:tr>
+        <w:trPr>
+          <w:cantSplit/>
+        </w:trPr>
+        <w:tc>
+          <w:tcPr>
+            <w:tcW w:type="dxa" w:w="3118"/>
+            <w:shd w:fill="F5F8FA"/>
+          </w:tcPr>
+          <w:p>
+            <w:r>
+              <w:rPr>
+                <w:rFonts w:ascii="Calibri" w:hAnsi="Calibri"/>
+                <w:sz w:val="20"/>
+              </w:rPr>
+              <w:t>Content Type</w:t>
+            </w:r>
+          </w:p>
+        </w:tc>
+        <w:tc>
+          <w:tcPr>
+            <w:tcW w:type="dxa" w:w="5783"/>
+            <w:shd w:fill="F5F8FA"/>
+          </w:tcPr>
+          <w:p>
+            <w:r>
+              <w:rPr>
+                <w:rFonts w:ascii="Calibri" w:hAnsi="Calibri"/>
+                <w:sz w:val="20"/>
+              </w:rPr>
+              <w:t>application/pdf</w:t>
+            </w:r>
+          </w:p>
+        </w:tc>
+      </w:tr>
+      <w:tr>
+        <w:trPr>
+          <w:cantSplit/>
+        </w:trPr>
+        <w:tc>
+          <w:tcPr>
+            <w:tcW w:type="dxa" w:w="3118"/>
+          </w:tcPr>
+          <w:p>
+            <w:r>
+              <w:rPr>
+                <w:rFonts w:ascii="Calibri" w:hAnsi="Calibri"/>
+                <w:sz w:val="20"/>
+              </w:rPr>
+              <w:t>Exist File Handling</w:t>
+            </w:r>
+          </w:p>
+        </w:tc>
+        <w:tc>
+          <w:tcPr>
+            <w:tcW w:type="dxa" w:w="5783"/>
+          </w:tcPr>
+          <w:p>
+            <w:r>
+              <w:rPr>
+                <w:rFonts w:ascii="Calibri" w:hAnsi="Calibri"/>
+                <w:sz w:val="20"/>
+              </w:rPr>
+              <w:t>overwrite</w:t>
+            </w:r>
+          </w:p>
+        </w:tc>
+      </w:tr>
+      <w:tr>
+        <w:trPr>
+          <w:cantSplit/>
+        </w:trPr>
+        <w:tc>
+          <w:tcPr>
+            <w:tcW w:type="dxa" w:w="3118"/>
+            <w:shd w:fill="F5F8FA"/>
+          </w:tcPr>
+          <w:p>
+            <w:r>
+              <w:rPr>
+                <w:rFonts w:ascii="Calibri" w:hAnsi="Calibri"/>
+                <w:sz w:val="20"/>
+              </w:rPr>
+              <w:t>Upload Message Attachments</w:t>
+            </w:r>
+          </w:p>
+        </w:tc>
+        <w:tc>
+          <w:tcPr>
+            <w:tcW w:type="dxa" w:w="5783"/>
+            <w:shd w:fill="F5F8FA"/>
+          </w:tcPr>
+          <w:p>
+            <w:r>
+              <w:rPr>
+                <w:rFonts w:ascii="Calibri" w:hAnsi="Calibri"/>
+                <w:sz w:val="20"/>
+              </w:rPr>
+              <w:t>false</w:t>
+            </w:r>
+          </w:p>
+        </w:tc>
+      </w:tr>
+      <w:tr>
+        <w:trPr>
+          <w:cantSplit/>
+        </w:trPr>
+        <w:tc>
+          <w:tcPr>
+            <w:tcW w:type="dxa" w:w="3118"/>
+          </w:tcPr>
+          <w:p>
+            <w:r>
+              <w:rPr>
+                <w:rFonts w:ascii="Calibri" w:hAnsi="Calibri"/>
+                <w:sz w:val="20"/>
+              </w:rPr>
+              <w:t>System</w:t>
+            </w:r>
+          </w:p>
+        </w:tc>
+        <w:tc>
+          <w:tcPr>
+            <w:tcW w:type="dxa" w:w="5783"/>
+          </w:tcPr>
+          <w:p>
+            <w:r>
+              <w:rPr>
+                <w:rFonts w:ascii="Calibri" w:hAnsi="Calibri"/>
+                <w:sz w:val="20"/>
+              </w:rPr>
+              <w:t>AWS-S3</w:t>
+            </w:r>
+          </w:p>
+        </w:tc>
+      </w:tr>
+      <w:tr>
+        <w:trPr>
+          <w:cantSplit/>
+        </w:trPr>
+        <w:tc>
+          <w:tcPr>
+            <w:tcW w:type="dxa" w:w="3118"/>
+            <w:shd w:fill="F5F8FA"/>
+          </w:tcPr>
+          <w:p>
+            <w:r>
+              <w:rPr>
+                <w:rFonts w:ascii="Calibri" w:hAnsi="Calibri"/>
+                <w:sz w:val="20"/>
+              </w:rPr>
+              <w:t>Transport Protocol</w:t>
+            </w:r>
+          </w:p>
+        </w:tc>
+        <w:tc>
+          <w:tcPr>
+            <w:tcW w:type="dxa" w:w="5783"/>
+            <w:shd w:fill="F5F8FA"/>
+          </w:tcPr>
+          <w:p>
+            <w:r>
+              <w:rPr>
+                <w:rFonts w:ascii="Calibri" w:hAnsi="Calibri"/>
+                <w:sz w:val="20"/>
+              </w:rPr>
+              <w:t>HTTPS</w:t>
+            </w:r>
+          </w:p>
+        </w:tc>
+      </w:tr>
+      <w:tr>
+        <w:trPr>
+          <w:cantSplit/>
+        </w:trPr>
+        <w:tc>
+          <w:tcPr>
+            <w:tcW w:type="dxa" w:w="3118"/>
+          </w:tcPr>
+          <w:p>
+            <w:r>
+              <w:rPr>
+                <w:rFonts w:ascii="Calibri" w:hAnsi="Calibri"/>
+                <w:sz w:val="20"/>
+              </w:rPr>
+              <w:t>Folder Name</w:t>
+            </w:r>
+          </w:p>
+        </w:tc>
+        <w:tc>
+          <w:tcPr>
+            <w:tcW w:type="dxa" w:w="5783"/>
+          </w:tcPr>
+          <w:p>
+            <w:r>
+              <w:rPr>
+                <w:rFonts w:ascii="Calibri" w:hAnsi="Calibri"/>
+                <w:sz w:val="20"/>
+              </w:rPr>
+              <w:t>${property.FolderName}</w:t>
+            </w:r>
+          </w:p>
+        </w:tc>
+      </w:tr>
+      <w:tr>
+        <w:trPr>
+          <w:cantSplit/>
+        </w:trPr>
+        <w:tc>
+          <w:tcPr>
+            <w:tcW w:type="dxa" w:w="3118"/>
+            <w:shd w:fill="F5F8FA"/>
+          </w:tcPr>
+          <w:p>
+            <w:r>
+              <w:rPr>
+                <w:rFonts w:ascii="Calibri" w:hAnsi="Calibri"/>
+                <w:sz w:val="20"/>
+              </w:rPr>
+              <w:t>Region Name</w:t>
+            </w:r>
+          </w:p>
+        </w:tc>
+        <w:tc>
+          <w:tcPr>
+            <w:tcW w:type="dxa" w:w="5783"/>
+            <w:shd w:fill="F5F8FA"/>
+          </w:tcPr>
+          <w:p>
+            <w:r>
+              <w:rPr>
+                <w:rFonts w:ascii="Calibri" w:hAnsi="Calibri"/>
+                <w:sz w:val="20"/>
+              </w:rPr>
+              <w:t>eu-central-1</w:t>
+            </w:r>
+          </w:p>
+        </w:tc>
+      </w:tr>
+      <w:tr>
+        <w:trPr>
+          <w:cantSplit/>
+        </w:trPr>
+        <w:tc>
+          <w:tcPr>
+            <w:tcW w:type="dxa" w:w="3118"/>
+          </w:tcPr>
+          <w:p>
+            <w:r>
+              <w:rPr>
+                <w:rFonts w:ascii="Calibri" w:hAnsi="Calibri"/>
+                <w:sz w:val="20"/>
+              </w:rPr>
+              <w:t>Storage Class</w:t>
+            </w:r>
+          </w:p>
+        </w:tc>
+        <w:tc>
+          <w:tcPr>
+            <w:tcW w:type="dxa" w:w="5783"/>
+          </w:tcPr>
+          <w:p>
+            <w:r>
+              <w:rPr>
+                <w:rFonts w:ascii="Calibri" w:hAnsi="Calibri"/>
+                <w:sz w:val="20"/>
+              </w:rPr>
+              <w:t>STANDARD</w:t>
+            </w:r>
+          </w:p>
+        </w:tc>
+      </w:tr>
+      <w:tr>
+        <w:trPr>
+          <w:cantSplit/>
+        </w:trPr>
+        <w:tc>
+          <w:tcPr>
+            <w:tcW w:type="dxa" w:w="3118"/>
+            <w:shd w:fill="F5F8FA"/>
+          </w:tcPr>
+          <w:p>
+            <w:r>
+              <w:rPr>
+                <w:rFonts w:ascii="Calibri" w:hAnsi="Calibri"/>
+                <w:sz w:val="20"/>
+              </w:rPr>
+              <w:t>Requester Pays</w:t>
+            </w:r>
+          </w:p>
+        </w:tc>
+        <w:tc>
+          <w:tcPr>
+            <w:tcW w:type="dxa" w:w="5783"/>
+            <w:shd w:fill="F5F8FA"/>
+          </w:tcPr>
+          <w:p>
+            <w:r>
+              <w:rPr>
+                <w:rFonts w:ascii="Calibri" w:hAnsi="Calibri"/>
+                <w:sz w:val="20"/>
+              </w:rPr>
+              <w:t>false</w:t>
+            </w:r>
+          </w:p>
+        </w:tc>
+      </w:tr>
+      <w:tr>
+        <w:trPr>
+          <w:cantSplit/>
+        </w:trPr>
+        <w:tc>
+          <w:tcPr>
+            <w:tcW w:type="dxa" w:w="3118"/>
+          </w:tcPr>
+          <w:p>
+            <w:r>
+              <w:rPr>
+                <w:rFonts w:ascii="Calibri" w:hAnsi="Calibri"/>
+                <w:sz w:val="20"/>
+              </w:rPr>
+              <w:t>Message Protocol</w:t>
+            </w:r>
+          </w:p>
+        </w:tc>
+        <w:tc>
+          <w:tcPr>
+            <w:tcW w:type="dxa" w:w="5783"/>
+          </w:tcPr>
+          <w:p>
+            <w:r>
+              <w:rPr>
+                <w:rFonts w:ascii="Calibri" w:hAnsi="Calibri"/>
+                <w:sz w:val="20"/>
+              </w:rPr>
+              <w:t>S3</w:t>
+            </w:r>
+          </w:p>
+        </w:tc>
+      </w:tr>
+      <w:tr>
+        <w:trPr>
+          <w:cantSplit/>
+        </w:trPr>
+        <w:tc>
+          <w:tcPr>
+            <w:tcW w:type="dxa" w:w="3118"/>
+            <w:shd w:fill="F5F8FA"/>
+          </w:tcPr>
+          <w:p>
+            <w:r>
+              <w:rPr>
+                <w:rFonts w:ascii="Calibri" w:hAnsi="Calibri"/>
+                <w:sz w:val="20"/>
+              </w:rPr>
+              <w:t>S3 Append Message Id</w:t>
+            </w:r>
+          </w:p>
+        </w:tc>
+        <w:tc>
+          <w:tcPr>
+            <w:tcW w:type="dxa" w:w="5783"/>
+            <w:shd w:fill="F5F8FA"/>
+          </w:tcPr>
+          <w:p>
+            <w:r>
+              <w:rPr>
+                <w:rFonts w:ascii="Calibri" w:hAnsi="Calibri"/>
+                <w:sz w:val="20"/>
+              </w:rPr>
+              <w:t>false</w:t>
+            </w:r>
+          </w:p>
+        </w:tc>
+      </w:tr>
+      <w:tr>
+        <w:trPr>
+          <w:cantSplit/>
+        </w:trPr>
+        <w:tc>
+          <w:tcPr>
+            <w:tcW w:type="dxa" w:w="3118"/>
+          </w:tcPr>
+          <w:p>
+            <w:r>
+              <w:rPr>
+                <w:rFonts w:ascii="Calibri" w:hAnsi="Calibri"/>
+                <w:sz w:val="20"/>
+              </w:rPr>
+              <w:t>S3 Append Timestamp</w:t>
+            </w:r>
+          </w:p>
+        </w:tc>
+        <w:tc>
+          <w:tcPr>
+            <w:tcW w:type="dxa" w:w="5783"/>
+          </w:tcPr>
+          <w:p>
+            <w:r>
+              <w:rPr>
+                <w:rFonts w:ascii="Calibri" w:hAnsi="Calibri"/>
+                <w:sz w:val="20"/>
+              </w:rPr>
+              <w:t>false</w:t>
+            </w:r>
+          </w:p>
+        </w:tc>
+      </w:tr>
+      <w:tr>
+        <w:trPr>
+          <w:cantSplit/>
+        </w:trPr>
+        <w:tc>
+          <w:tcPr>
+            <w:tcW w:type="dxa" w:w="3118"/>
+            <w:shd w:fill="F5F8FA"/>
+          </w:tcPr>
+          <w:p>
+            <w:r>
+              <w:rPr>
+                <w:rFonts w:ascii="Calibri" w:hAnsi="Calibri"/>
+                <w:sz w:val="20"/>
+              </w:rPr>
+              <w:t>Vendor</w:t>
+            </w:r>
+          </w:p>
+        </w:tc>
+        <w:tc>
+          <w:tcPr>
+            <w:tcW w:type="dxa" w:w="5783"/>
+            <w:shd w:fill="F5F8FA"/>
+          </w:tcPr>
+          <w:p>
+            <w:r>
+              <w:rPr>
+                <w:rFonts w:ascii="Calibri" w:hAnsi="Calibri"/>
+                <w:sz w:val="20"/>
+              </w:rPr>
+              <w:t>rojoconsultancy.com</w:t>
+            </w:r>
+          </w:p>
+        </w:tc>
+      </w:tr>
+      <w:tr>
+        <w:trPr>
+          <w:cantSplit/>
+        </w:trPr>
+        <w:tc>
+          <w:tcPr>
+            <w:tcW w:type="dxa" w:w="3118"/>
+          </w:tcPr>
+          <w:p>
+            <w:r>
+              <w:rPr>
+                <w:rFonts w:ascii="Calibri" w:hAnsi="Calibri"/>
+                <w:sz w:val="20"/>
+              </w:rPr>
+              <w:t>List Operation Include Sub Directories</w:t>
+            </w:r>
+          </w:p>
+        </w:tc>
+        <w:tc>
+          <w:tcPr>
+            <w:tcW w:type="dxa" w:w="5783"/>
+          </w:tcPr>
+          <w:p>
+            <w:r>
+              <w:rPr>
+                <w:rFonts w:ascii="Calibri" w:hAnsi="Calibri"/>
+                <w:sz w:val="20"/>
+              </w:rPr>
+              <w:t>false</w:t>
+            </w:r>
+          </w:p>
+        </w:tc>
+      </w:tr>
+      <w:tr>
+        <w:trPr>
+          <w:cantSplit/>
+        </w:trPr>
+        <w:tc>
+          <w:tcPr>
+            <w:tcW w:type="dxa" w:w="3118"/>
+            <w:shd w:fill="F5F8FA"/>
+          </w:tcPr>
+          <w:p>
+            <w:r>
+              <w:rPr>
+                <w:rFonts w:ascii="Calibri" w:hAnsi="Calibri"/>
+                <w:sz w:val="20"/>
+              </w:rPr>
+              <w:t>Connect Via Sdk</w:t>
+            </w:r>
+          </w:p>
+        </w:tc>
+        <w:tc>
+          <w:tcPr>
+            <w:tcW w:type="dxa" w:w="5783"/>
+            <w:shd w:fill="F5F8FA"/>
+          </w:tcPr>
+          <w:p>
+            <w:r>
+              <w:rPr>
+                <w:rFonts w:ascii="Calibri" w:hAnsi="Calibri"/>
+                <w:sz w:val="20"/>
+              </w:rPr>
+              <w:t>false</w:t>
+            </w:r>
+          </w:p>
+        </w:tc>
+      </w:tr>
+      <w:tr>
+        <w:trPr>
+          <w:cantSplit/>
+        </w:trPr>
+        <w:tc>
+          <w:tcPr>
+            <w:tcW w:type="dxa" w:w="3118"/>
+          </w:tcPr>
+          <w:p>
+            <w:r>
+              <w:rPr>
+                <w:rFonts w:ascii="Calibri" w:hAnsi="Calibri"/>
+                <w:sz w:val="20"/>
+              </w:rPr>
+              <w:t>Apply Encryption When Archiving</w:t>
+            </w:r>
+          </w:p>
+        </w:tc>
+        <w:tc>
+          <w:tcPr>
+            <w:tcW w:type="dxa" w:w="5783"/>
+          </w:tcPr>
+          <w:p>
+            <w:r>
+              <w:rPr>
+                <w:rFonts w:ascii="Calibri" w:hAnsi="Calibri"/>
+                <w:sz w:val="20"/>
+              </w:rPr>
+              <w:t>false</w:t>
+            </w:r>
+          </w:p>
+        </w:tc>
+      </w:tr>
+      <w:tr>
+        <w:trPr>
+          <w:cantSplit/>
+        </w:trPr>
+        <w:tc>
+          <w:tcPr>
+            <w:tcW w:type="dxa" w:w="3118"/>
+            <w:shd w:fill="F5F8FA"/>
+          </w:tcPr>
+          <w:p>
+            <w:r>
+              <w:rPr>
+                <w:rFonts w:ascii="Calibri" w:hAnsi="Calibri"/>
+                <w:sz w:val="20"/>
+              </w:rPr>
+              <w:t>Sorting For List Operation</w:t>
+            </w:r>
+          </w:p>
+        </w:tc>
+        <w:tc>
+          <w:tcPr>
+            <w:tcW w:type="dxa" w:w="5783"/>
+            <w:shd w:fill="F5F8FA"/>
+          </w:tcPr>
+          <w:p>
+            <w:r>
+              <w:rPr>
+                <w:rFonts w:ascii="Calibri" w:hAnsi="Calibri"/>
+                <w:sz w:val="20"/>
+              </w:rPr>
+              <w:t>none</w:t>
+            </w:r>
+          </w:p>
+        </w:tc>
+      </w:tr>
+      <w:tr>
+        <w:trPr>
+          <w:cantSplit/>
+        </w:trPr>
+        <w:tc>
+          <w:tcPr>
+            <w:tcW w:type="dxa" w:w="3118"/>
+          </w:tcPr>
+          <w:p>
+            <w:r>
+              <w:rPr>
+                <w:rFonts w:ascii="Calibri" w:hAnsi="Calibri"/>
+                <w:sz w:val="20"/>
+              </w:rPr>
+              <w:t>Query Timeout</w:t>
+            </w:r>
+          </w:p>
+        </w:tc>
+        <w:tc>
+          <w:tcPr>
+            <w:tcW w:type="dxa" w:w="5783"/>
+          </w:tcPr>
+          <w:p>
+            <w:r>
+              <w:rPr>
+                <w:rFonts w:ascii="Calibri" w:hAnsi="Calibri"/>
+                <w:sz w:val="20"/>
+              </w:rPr>
+              <w:t>3</w:t>
+            </w:r>
+          </w:p>
+        </w:tc>
+      </w:tr>
+      <w:tr>
+        <w:trPr>
+          <w:cantSplit/>
+        </w:trPr>
+        <w:tc>
+          <w:tcPr>
+            <w:tcW w:type="dxa" w:w="3118"/>
+            <w:shd w:fill="F5F8FA"/>
+          </w:tcPr>
+          <w:p>
+            <w:r>
+              <w:rPr>
+                <w:rFonts w:ascii="Calibri" w:hAnsi="Calibri"/>
+                <w:sz w:val="20"/>
+              </w:rPr>
+              <w:t>Page Size</w:t>
+            </w:r>
+          </w:p>
+        </w:tc>
+        <w:tc>
+          <w:tcPr>
+            <w:tcW w:type="dxa" w:w="5783"/>
+            <w:shd w:fill="F5F8FA"/>
+          </w:tcPr>
+          <w:p>
+            <w:r>
+              <w:rPr>
+                <w:rFonts w:ascii="Calibri" w:hAnsi="Calibri"/>
+                <w:sz w:val="20"/>
+              </w:rPr>
+              <w:t>100000</w:t>
+            </w:r>
+          </w:p>
+        </w:tc>
+      </w:tr>
+      <w:tr>
+        <w:trPr>
+          <w:cantSplit/>
+        </w:trPr>
+        <w:tc>
+          <w:tcPr>
+            <w:tcW w:type="dxa" w:w="3118"/>
+          </w:tcPr>
+          <w:p>
+            <w:r>
+              <w:rPr>
+                <w:rFonts w:ascii="Calibri" w:hAnsi="Calibri"/>
+                <w:sz w:val="20"/>
+              </w:rPr>
+              <w:t>Vendor</w:t>
+            </w:r>
+          </w:p>
+        </w:tc>
+        <w:tc>
+          <w:tcPr>
+            <w:tcW w:type="dxa" w:w="5783"/>
+          </w:tcPr>
+          <w:p>
+            <w:r>
+              <w:rPr>
+                <w:rFonts w:ascii="Calibri" w:hAnsi="Calibri"/>
+                <w:sz w:val="20"/>
+              </w:rPr>
+              <w:t>SAP</w:t>
+            </w:r>
+          </w:p>
+        </w:tc>
+      </w:tr>
+      <w:tr>
+        <w:trPr>
+          <w:cantSplit/>
+        </w:trPr>
+        <w:tc>
+          <w:tcPr>
+            <w:tcW w:type="dxa" w:w="3118"/>
+            <w:shd w:fill="F5F8FA"/>
+          </w:tcPr>
+          <w:p>
+            <w:r>
+              <w:rPr>
+                <w:rFonts w:ascii="Calibri" w:hAnsi="Calibri"/>
+                <w:sz w:val="20"/>
+              </w:rPr>
+              <w:t>Batch Operation</w:t>
+            </w:r>
+          </w:p>
+        </w:tc>
+        <w:tc>
+          <w:tcPr>
+            <w:tcW w:type="dxa" w:w="5783"/>
+            <w:shd w:fill="F5F8FA"/>
+          </w:tcPr>
+          <w:p>
+            <w:r>
+              <w:rPr>
+                <w:rFonts w:ascii="Calibri" w:hAnsi="Calibri"/>
+                <w:sz w:val="20"/>
+              </w:rPr>
+              <w:t>atomic</w:t>
+            </w:r>
+          </w:p>
+        </w:tc>
+      </w:tr>
+      <w:tr>
+        <w:trPr>
+          <w:cantSplit/>
+        </w:trPr>
+        <w:tc>
+          <w:tcPr>
+            <w:tcW w:type="dxa" w:w="3118"/>
+          </w:tcPr>
+          <w:p>
+            <w:r>
+              <w:rPr>
+                <w:rFonts w:ascii="Calibri" w:hAnsi="Calibri"/>
+                <w:sz w:val="20"/>
+              </w:rPr>
+              <w:t>System</w:t>
+            </w:r>
+          </w:p>
+        </w:tc>
+        <w:tc>
+          <w:tcPr>
+            <w:tcW w:type="dxa" w:w="5783"/>
+          </w:tcPr>
+          <w:p>
+            <w:r>
+              <w:rPr>
+                <w:rFonts w:ascii="Calibri" w:hAnsi="Calibri"/>
+                <w:sz w:val="20"/>
+              </w:rPr>
+              <w:t>SynLogisticsPlatform_Database</w:t>
+            </w:r>
+          </w:p>
+        </w:tc>
+      </w:tr>
+      <w:tr>
+        <w:trPr>
+          <w:cantSplit/>
+        </w:trPr>
+        <w:tc>
+          <w:tcPr>
+            <w:tcW w:type="dxa" w:w="3118"/>
+            <w:shd w:fill="F5F8FA"/>
+          </w:tcPr>
+          <w:p>
+            <w:r>
+              <w:rPr>
+                <w:rFonts w:ascii="Calibri" w:hAnsi="Calibri"/>
+                <w:sz w:val="20"/>
+              </w:rPr>
+              <w:t>Batch Mode</w:t>
+            </w:r>
+          </w:p>
+        </w:tc>
+        <w:tc>
+          <w:tcPr>
+            <w:tcW w:type="dxa" w:w="5783"/>
+            <w:shd w:fill="F5F8FA"/>
+          </w:tcPr>
+          <w:p>
+            <w:r>
+              <w:rPr>
+                <w:rFonts w:ascii="Calibri" w:hAnsi="Calibri"/>
+                <w:sz w:val="20"/>
+              </w:rPr>
+              <w:t>false</w:t>
+            </w:r>
+          </w:p>
+        </w:tc>
+      </w:tr>
+      <w:tr>
+        <w:trPr>
+          <w:cantSplit/>
+        </w:trPr>
+        <w:tc>
+          <w:tcPr>
+            <w:tcW w:type="dxa" w:w="3118"/>
+          </w:tcPr>
+          <w:p>
+            <w:r>
+              <w:rPr>
+                <w:rFonts w:ascii="Calibri" w:hAnsi="Calibri"/>
+                <w:sz w:val="20"/>
+              </w:rPr>
+              <w:t>Transport Protocol</w:t>
+            </w:r>
+          </w:p>
+        </w:tc>
+        <w:tc>
+          <w:tcPr>
+            <w:tcW w:type="dxa" w:w="5783"/>
+          </w:tcPr>
+          <w:p>
+            <w:r>
+              <w:rPr>
+                <w:rFonts w:ascii="Calibri" w:hAnsi="Calibri"/>
+                <w:sz w:val="20"/>
+              </w:rPr>
+              <w:t>JDBC</w:t>
+            </w:r>
+          </w:p>
+        </w:tc>
+      </w:tr>
+      <w:tr>
+        <w:trPr>
+          <w:cantSplit/>
+        </w:trPr>
+        <w:tc>
+          <w:tcPr>
+            <w:tcW w:type="dxa" w:w="3118"/>
+            <w:shd w:fill="F5F8FA"/>
+          </w:tcPr>
+          <w:p>
+            <w:r>
+              <w:rPr>
+                <w:rFonts w:ascii="Calibri" w:hAnsi="Calibri"/>
+                <w:sz w:val="20"/>
+              </w:rPr>
+              <w:t>Connection Timeout</w:t>
+            </w:r>
+          </w:p>
+        </w:tc>
+        <w:tc>
+          <w:tcPr>
+            <w:tcW w:type="dxa" w:w="5783"/>
+            <w:shd w:fill="F5F8FA"/>
+          </w:tcPr>
+          <w:p>
+            <w:r>
+              <w:rPr>
+                <w:rFonts w:ascii="Calibri" w:hAnsi="Calibri"/>
+                <w:sz w:val="20"/>
+              </w:rPr>
+              <w:t>3</w:t>
+            </w:r>
+          </w:p>
+        </w:tc>
+      </w:tr>
+      <w:tr>
+        <w:trPr>
+          <w:cantSplit/>
+        </w:trPr>
+        <w:tc>
+          <w:tcPr>
+            <w:tcW w:type="dxa" w:w="3118"/>
+          </w:tcPr>
+          <w:p>
+            <w:r>
+              <w:rPr>
+                <w:rFonts w:ascii="Calibri" w:hAnsi="Calibri"/>
+                <w:sz w:val="20"/>
+              </w:rPr>
+              <w:t>Message Protocol</w:t>
+            </w:r>
+          </w:p>
+        </w:tc>
+        <w:tc>
+          <w:tcPr>
+            <w:tcW w:type="dxa" w:w="5783"/>
+          </w:tcPr>
+          <w:p>
+            <w:r>
+              <w:rPr>
+                <w:rFonts w:ascii="Calibri" w:hAnsi="Calibri"/>
+                <w:sz w:val="20"/>
+              </w:rPr>
+              <w:t>JDBC</w:t>
+            </w:r>
+          </w:p>
+        </w:tc>
+      </w:tr>
+    </w:tbl>
+    <w:p/>
+    <w:p>
+      <w:pPr>
+        <w:pStyle w:val="Heading2"/>
+        <w:keepNext/>
+        <w:keepLines/>
+        <w:outlineLvl w:val="1"/>
+      </w:pPr>
+      <w:r>
+        <w:rPr>
+          <w:rFonts w:ascii="Calibri Light" w:hAnsi="Calibri Light"/>
+          <w:color w:val="0078B4"/>
+          <w:sz w:val="28"/>
+        </w:rPr>
+        <w:t>5.5 Mappings</w:t>
+      </w:r>
+    </w:p>
+    <w:tbl>
+      <w:tblPr>
+        <w:tblStyle w:val="TableGrid"/>
+        <w:tblW w:type="auto" w:w="0"/>
+        <w:jc w:val="left"/>
+        <w:tblLayout w:type="fixed"/>
+        <w:tblLook w:firstColumn="1" w:firstRow="1" w:lastColumn="0" w:lastRow="0" w:noHBand="0" w:noVBand="1" w:val="04A0"/>
+      </w:tblPr>
+      <w:tblGrid>
+        <w:gridCol w:w="2268"/>
+        <w:gridCol w:w="2835"/>
+        <w:gridCol w:w="3798"/>
+      </w:tblGrid>
+      <w:tr>
+        <w:trPr>
+          <w:tblHeader w:val="true"/>
+          <w:cantSplit/>
+        </w:trPr>
+        <w:tc>
+          <w:tcPr>
+            <w:tcW w:type="dxa" w:w="2268"/>
+            <w:shd w:fill="005293"/>
+          </w:tcPr>
+          <w:p>
+            <w:pPr>
+              <w:keepNext/>
+            </w:pPr>
+            <w:r>
+              <w:rPr>
+                <w:rFonts w:ascii="Calibri" w:hAnsi="Calibri"/>
+                <w:b/>
+                <w:color w:val="FFFFFF"/>
+                <w:sz w:val="20"/>
+              </w:rPr>
+              <w:t>Name</w:t>
+            </w:r>
+          </w:p>
+        </w:tc>
+        <w:tc>
+          <w:tcPr>
+            <w:tcW w:type="dxa" w:w="2835"/>
+            <w:shd w:fill="005293"/>
+          </w:tcPr>
+          <w:p>
+            <w:pPr>
+              <w:keepNext/>
+            </w:pPr>
+            <w:r>
+              <w:rPr>
+                <w:rFonts w:ascii="Calibri" w:hAnsi="Calibri"/>
+                <w:b/>
+                <w:color w:val="FFFFFF"/>
+                <w:sz w:val="20"/>
+              </w:rPr>
+              <w:t>2-Line Summary</w:t>
+            </w:r>
+          </w:p>
+        </w:tc>
+        <w:tc>
+          <w:tcPr>
+            <w:tcW w:type="dxa" w:w="3798"/>
+            <w:shd w:fill="005293"/>
+          </w:tcPr>
+          <w:p>
+            <w:pPr>
+              <w:keepNext/>
+            </w:pPr>
+            <w:r>
+              <w:rPr>
+                <w:rFonts w:ascii="Calibri" w:hAnsi="Calibri"/>
+                <w:b/>
+                <w:color w:val="FFFFFF"/>
+                <w:sz w:val="20"/>
+              </w:rPr>
+              <w:t>Mapping File Link</w:t>
+            </w:r>
+          </w:p>
+        </w:tc>
+      </w:tr>
+      <w:tr>
+        <w:trPr>
+          <w:cantSplit/>
+        </w:trPr>
+        <w:tc>
+          <w:tcPr>
+            <w:tcW w:type="dxa" w:w="2268"/>
+          </w:tcPr>
+          <w:p>
+            <w:r>
+              <w:rPr>
+                <w:rFonts w:ascii="Calibri" w:hAnsi="Calibri"/>
+                <w:sz w:val="20"/>
+              </w:rPr>
+              <w:t>BusinessDocumentMapping</w:t>
+            </w:r>
+          </w:p>
+        </w:tc>
+        <w:tc>
+          <w:tcPr>
+            <w:tcW w:type="dxa" w:w="2835"/>
+          </w:tcPr>
+          <w:p>
+            <w:r>
+              <w:rPr>
+                <w:rFonts w:ascii="Calibri" w:hAnsi="Calibri"/>
+                <w:sz w:val="20"/>
+              </w:rPr>
+              <w:t>This mapping applies the configured transformation logic for BusinessDocumentMapping within SAP CI.</w:t>
+              <w:br/>
+              <w:t>It is executed during message processing to reshape the payload before the next handoff.</w:t>
+            </w:r>
+          </w:p>
+        </w:tc>
+        <w:tc>
+          <w:tcPr>
+            <w:tcW w:type="dxa" w:w="3798"/>
+          </w:tcPr>
+          <w:p>
+            <w:r>
+              <w:rPr>
+                <w:rFonts w:ascii="Calibri" w:hAnsi="Calibri"/>
+                <w:sz w:val="20"/>
+              </w:rPr>
               <w:t>src\main\resources\mapping\BusinessDocumentMapping.mmap</w:t>
+            </w:r>
+          </w:p>
+        </w:tc>
+      </w:tr>
+    </w:tbl>
+    <w:p/>
+    <w:p>
+      <w:pPr>
+        <w:pStyle w:val="Heading3"/>
+        <w:keepNext/>
+        <w:keepLines/>
+        <w:outlineLvl w:val="2"/>
+        <w:collapsed w:val="1"/>
+        <w15:collapsed xmlns:w15="http://schemas.microsoft.com/office/word/2012/wordml"/>
+      </w:pPr>
+      <w:r>
+        <w:rPr>
+          <w:rFonts w:ascii="Calibri Light" w:hAnsi="Calibri Light"/>
+          <w:color w:val="212529"/>
+          <w:sz w:val="24"/>
+        </w:rPr>
+        <w:t>BusinessDocumentMapping</w:t>
+      </w:r>
+    </w:p>
+    <w:tbl>
+      <w:tblPr>
+        <w:tblStyle w:val="TableGrid"/>
+        <w:tblW w:type="auto" w:w="0"/>
+        <w:jc w:val="left"/>
+        <w:tblLayout w:type="fixed"/>
+        <w:tblLook w:firstColumn="1" w:firstRow="1" w:lastColumn="0" w:lastRow="0" w:noHBand="0" w:noVBand="1" w:val="04A0"/>
+      </w:tblPr>
+      <w:tblGrid>
+        <w:gridCol w:w="3118"/>
+        <w:gridCol w:w="5783"/>
+      </w:tblGrid>
+      <w:tr>
+        <w:trPr>
+          <w:tblHeader w:val="true"/>
+          <w:cantSplit/>
+        </w:trPr>
+        <w:tc>
+          <w:tcPr>
+            <w:tcW w:type="dxa" w:w="3118"/>
+            <w:shd w:fill="005293"/>
+          </w:tcPr>
+          <w:p>
+            <w:pPr>
+              <w:keepNext/>
+            </w:pPr>
+            <w:r>
+              <w:rPr>
+                <w:rFonts w:ascii="Calibri" w:hAnsi="Calibri"/>
+                <w:b/>
+                <w:color w:val="FFFFFF"/>
+                <w:sz w:val="20"/>
+              </w:rPr>
+              <w:t>Attribute</w:t>
+            </w:r>
+          </w:p>
+        </w:tc>
+        <w:tc>
+          <w:tcPr>
+            <w:tcW w:type="dxa" w:w="5783"/>
+            <w:shd w:fill="005293"/>
+          </w:tcPr>
+          <w:p>
+            <w:pPr>
+              <w:keepNext/>
+            </w:pPr>
+            <w:r>
+              <w:rPr>
+                <w:rFonts w:ascii="Calibri" w:hAnsi="Calibri"/>
+                <w:b/>
+                <w:color w:val="FFFFFF"/>
+                <w:sz w:val="20"/>
+              </w:rPr>
+              <w:t>Value</w:t>
+            </w:r>
+          </w:p>
+        </w:tc>
+      </w:tr>
+      <w:tr>
+        <w:trPr>
+          <w:cantSplit/>
+        </w:trPr>
+        <w:tc>
+          <w:tcPr>
+            <w:tcW w:type="dxa" w:w="3118"/>
+          </w:tcPr>
+          <w:p>
+            <w:r>
+              <w:rPr>
+                <w:rFonts w:ascii="Calibri" w:hAnsi="Calibri"/>
+                <w:sz w:val="20"/>
+              </w:rPr>
+              <w:t>Source Message / Object</w:t>
+            </w:r>
+          </w:p>
+        </w:tc>
+        <w:tc>
+          <w:tcPr>
+            <w:tcW w:type="dxa" w:w="5783"/>
+          </w:tcPr>
+          <w:p>
+            <w:r>
+              <w:rPr>
+                <w:rFonts w:ascii="Calibri" w:hAnsi="Calibri"/>
+                <w:sz w:val="20"/>
+              </w:rPr>
+              <w:t>BusinessDocumentMapping</w:t>
+            </w:r>
+          </w:p>
+        </w:tc>
+      </w:tr>
+      <w:tr>
+        <w:trPr>
+          <w:cantSplit/>
+        </w:trPr>
+        <w:tc>
+          <w:tcPr>
+            <w:tcW w:type="dxa" w:w="3118"/>
+            <w:shd w:fill="F5F8FA"/>
+          </w:tcPr>
+          <w:p>
+            <w:r>
+              <w:rPr>
+                <w:rFonts w:ascii="Calibri" w:hAnsi="Calibri"/>
+                <w:sz w:val="20"/>
+              </w:rPr>
+              <w:t>Target Message / Object</w:t>
+            </w:r>
+          </w:p>
+        </w:tc>
+        <w:tc>
+          <w:tcPr>
+            <w:tcW w:type="dxa" w:w="5783"/>
+            <w:shd w:fill="F5F8FA"/>
+          </w:tcPr>
+          <w:p>
+            <w:r>
+              <w:rPr>
+                <w:rFonts w:ascii="Calibri" w:hAnsi="Calibri"/>
+                <w:sz w:val="20"/>
+              </w:rPr>
+              <w:t>Not identified</w:t>
             </w:r>
           </w:p>
         </w:tc>
@@ -5272,7 +6957,7 @@
                 <w:rFonts w:ascii="Calibri" w:hAnsi="Calibri"/>
                 <w:sz w:val="20"/>
               </w:rPr>
-              <w:t>RoleBased for HTTPS sender, AWS Access Key/Secret Key for S3, JDBC alias for database</w:t>
+              <w:t>RoleBased authentication for the HTTPS sender adapter.</w:t>
             </w:r>
           </w:p>
         </w:tc>
@@ -5307,7 +6992,7 @@
                 <w:rFonts w:ascii="Calibri" w:hAnsi="Calibri"/>
                 <w:sz w:val="20"/>
               </w:rPr>
-              <w:t>ESBMessaging.send role for sender</w:t>
+              <w:t>User role ESBMessaging.send is required.</w:t>
             </w:r>
           </w:p>
         </w:tc>
@@ -5340,7 +7025,7 @@
                 <w:rFonts w:ascii="Calibri" w:hAnsi="Calibri"/>
                 <w:sz w:val="20"/>
               </w:rPr>
-              <w:t>HTTPS for sender, SSE-S3 for S3 receiver</w:t>
+              <w:t>HTTPS for transport security to Foundation system; SSE-S3 for AWS S3 server-side encryption.</w:t>
             </w:r>
           </w:p>
         </w:tc>
@@ -5639,7 +7324,7 @@
           <w:color w:val="212529"/>
           <w:sz w:val="22"/>
         </w:rPr>
-        <w:t>Groovy scripts are used within the mapping to perform custom data transformations. The concatenate.groovy script is used to concatenate strings.</w:t>
+        <w:t>Groovy scripts are used in this iFlow to perform custom data transformations within the mapping. Specifically, the 'concatenate' script is used to concatenate string values.</w:t>
       </w:r>
     </w:p>
     <w:p>
@@ -5848,7 +7533,7 @@
                 <w:rFonts w:ascii="Calibri" w:hAnsi="Calibri"/>
                 <w:sz w:val="20"/>
               </w:rPr>
-              <w:t>The iFlow includes an exception subprocess to handle errors. When an error occurs, the exception subprocess logs the error details to the SynLogisticsPlatform database.</w:t>
+              <w:t>The iFlow includes an exception subprocess to handle errors. When an error occurs, the exception details are logged to the SynLogisticsPlatform_Database.</w:t>
             </w:r>
           </w:p>
         </w:tc>
@@ -5883,7 +7568,7 @@
                 <w:rFonts w:ascii="Calibri" w:hAnsi="Calibri"/>
                 <w:sz w:val="20"/>
               </w:rPr>
-              <w:t>The exception subprocess calls a stored procedure to log the exception details, including the document number, folder name, and error message.</w:t>
+              <w:t>The exception subprocess captures errors, sets a timestamp property, and calls a stored procedure (sp_crud_bravo_order_technical_exception_log) to log the exception details to the database. It then invokes the 'Invoke JDBC' process to execute the database query.</w:t>
             </w:r>
           </w:p>
         </w:tc>
@@ -5981,7 +7666,7 @@
       <w:r>
         <w:drawing>
           <wp:inline xmlns:a="http://schemas.openxmlformats.org/drawingml/2006/main" xmlns:pic="http://schemas.openxmlformats.org/drawingml/2006/picture">
-            <wp:extent cx="4937760" cy="1464375"/>
+            <wp:extent cx="4937760" cy="2272044"/>
             <wp:docPr id="5" name="Picture 5"/>
             <wp:cNvGraphicFramePr>
               <a:graphicFrameLocks noChangeAspect="1"/>
@@ -6002,7 +7687,7 @@
                   <pic:spPr>
                     <a:xfrm>
                       <a:off x="0" y="0"/>
-                      <a:ext cx="4937760" cy="1464375"/>
+                      <a:ext cx="4937760" cy="2272044"/>
                     </a:xfrm>
                     <a:prstGeom prst="rect"/>
                   </pic:spPr>
@@ -6023,7 +7708,7 @@
           <w:color w:val="6C757D"/>
           <w:sz w:val="20"/>
         </w:rPr>
-        <w:t>Figure: Exception SubProcess (Copied from Integration Flow Diagram)</w:t>
+        <w:t>Figure: Exception SubProcess Diagram</w:t>
       </w:r>
     </w:p>
     <w:p/>
@@ -6506,7 +8191,7 @@
                 <w:rFonts w:ascii="Calibri" w:hAnsi="Calibri"/>
                 <w:sz w:val="20"/>
               </w:rPr>
-              <w:t>Foundation_BusinessDocumentPDF_IDT_Subscriber</w:t>
+              <w:t>Not found in iFlow</w:t>
             </w:r>
           </w:p>
         </w:tc>

</xml_diff>